<commit_message>
Thêm validation cho login admin
</commit_message>
<xml_diff>
--- a/BaoCaoDoAnChuyenNghanh.docx
+++ b/BaoCaoDoAnChuyenNghanh.docx
@@ -1428,17 +1428,17 @@
           <w:szCs w:val="26"/>
           <w:lang w:val="en-US"/>
         </w:rPr>
-        <w:t>. T</w:t>
-      </w:r>
-      <w:proofErr w:type="spellStart"/>
-      <w:r>
-        <w:rPr>
-          <w:rFonts w:asciiTheme="majorHAnsi" w:hAnsiTheme="majorHAnsi" w:cstheme="majorHAnsi"/>
-          <w:sz w:val="26"/>
-          <w:szCs w:val="26"/>
-          <w:lang w:val="en-US"/>
-        </w:rPr>
-        <w:t>rần</w:t>
+        <w:t xml:space="preserve">. </w:t>
+      </w:r>
+      <w:proofErr w:type="spellStart"/>
+      <w:r>
+        <w:rPr>
+          <w:rFonts w:asciiTheme="majorHAnsi" w:hAnsiTheme="majorHAnsi" w:cstheme="majorHAnsi"/>
+          <w:sz w:val="26"/>
+          <w:szCs w:val="26"/>
+          <w:lang w:val="en-US"/>
+        </w:rPr>
+        <w:t>Trần</w:t>
       </w:r>
       <w:proofErr w:type="spellEnd"/>
       <w:r>
@@ -11351,47 +11351,87 @@
           <w:szCs w:val="26"/>
           <w:lang w:val="en-US"/>
         </w:rPr>
-        <w:t>tốc</w:t>
-      </w:r>
-      <w:proofErr w:type="spellEnd"/>
-      <w:r>
-        <w:rPr>
-          <w:rFonts w:asciiTheme="majorHAnsi" w:hAnsiTheme="majorHAnsi" w:cstheme="majorHAnsi"/>
-          <w:sz w:val="26"/>
-          <w:szCs w:val="26"/>
-          <w:lang w:val="en-US"/>
-        </w:rPr>
-        <w:t xml:space="preserve"> </w:t>
-      </w:r>
-      <w:proofErr w:type="spellStart"/>
-      <w:r>
-        <w:rPr>
-          <w:rFonts w:asciiTheme="majorHAnsi" w:hAnsiTheme="majorHAnsi" w:cstheme="majorHAnsi"/>
-          <w:sz w:val="26"/>
-          <w:szCs w:val="26"/>
-          <w:lang w:val="en-US"/>
-        </w:rPr>
-        <w:t>độ</w:t>
-      </w:r>
-      <w:proofErr w:type="spellEnd"/>
-      <w:r>
-        <w:rPr>
-          <w:rFonts w:asciiTheme="majorHAnsi" w:hAnsiTheme="majorHAnsi" w:cstheme="majorHAnsi"/>
-          <w:sz w:val="26"/>
-          <w:szCs w:val="26"/>
-          <w:lang w:val="en-US"/>
-        </w:rPr>
-        <w:t xml:space="preserve"> </w:t>
-      </w:r>
-      <w:proofErr w:type="spellStart"/>
-      <w:r>
-        <w:rPr>
-          <w:rFonts w:asciiTheme="majorHAnsi" w:hAnsiTheme="majorHAnsi" w:cstheme="majorHAnsi"/>
-          <w:sz w:val="26"/>
-          <w:szCs w:val="26"/>
-          <w:lang w:val="en-US"/>
-        </w:rPr>
-        <w:t>cao</w:t>
+        <w:t>hỗ</w:t>
+      </w:r>
+      <w:proofErr w:type="spellEnd"/>
+      <w:r>
+        <w:rPr>
+          <w:rFonts w:asciiTheme="majorHAnsi" w:hAnsiTheme="majorHAnsi" w:cstheme="majorHAnsi"/>
+          <w:sz w:val="26"/>
+          <w:szCs w:val="26"/>
+          <w:lang w:val="en-US"/>
+        </w:rPr>
+        <w:t xml:space="preserve"> </w:t>
+      </w:r>
+      <w:proofErr w:type="spellStart"/>
+      <w:r>
+        <w:rPr>
+          <w:rFonts w:asciiTheme="majorHAnsi" w:hAnsiTheme="majorHAnsi" w:cstheme="majorHAnsi"/>
+          <w:sz w:val="26"/>
+          <w:szCs w:val="26"/>
+          <w:lang w:val="en-US"/>
+        </w:rPr>
+        <w:t>trợ</w:t>
+      </w:r>
+      <w:proofErr w:type="spellEnd"/>
+      <w:r>
+        <w:rPr>
+          <w:rFonts w:asciiTheme="majorHAnsi" w:hAnsiTheme="majorHAnsi" w:cstheme="majorHAnsi"/>
+          <w:sz w:val="26"/>
+          <w:szCs w:val="26"/>
+          <w:lang w:val="en-US"/>
+        </w:rPr>
+        <w:t xml:space="preserve"> </w:t>
+      </w:r>
+      <w:proofErr w:type="spellStart"/>
+      <w:r>
+        <w:rPr>
+          <w:rFonts w:asciiTheme="majorHAnsi" w:hAnsiTheme="majorHAnsi" w:cstheme="majorHAnsi"/>
+          <w:sz w:val="26"/>
+          <w:szCs w:val="26"/>
+          <w:lang w:val="en-US"/>
+        </w:rPr>
+        <w:t>người</w:t>
+      </w:r>
+      <w:proofErr w:type="spellEnd"/>
+      <w:r>
+        <w:rPr>
+          <w:rFonts w:asciiTheme="majorHAnsi" w:hAnsiTheme="majorHAnsi" w:cstheme="majorHAnsi"/>
+          <w:sz w:val="26"/>
+          <w:szCs w:val="26"/>
+          <w:lang w:val="en-US"/>
+        </w:rPr>
+        <w:t xml:space="preserve"> </w:t>
+      </w:r>
+      <w:proofErr w:type="spellStart"/>
+      <w:r>
+        <w:rPr>
+          <w:rFonts w:asciiTheme="majorHAnsi" w:hAnsiTheme="majorHAnsi" w:cstheme="majorHAnsi"/>
+          <w:sz w:val="26"/>
+          <w:szCs w:val="26"/>
+          <w:lang w:val="en-US"/>
+        </w:rPr>
+        <w:t>dùng</w:t>
+      </w:r>
+      <w:proofErr w:type="spellEnd"/>
+      <w:r>
+        <w:rPr>
+          <w:rFonts w:asciiTheme="majorHAnsi" w:hAnsiTheme="majorHAnsi" w:cstheme="majorHAnsi"/>
+          <w:sz w:val="26"/>
+          <w:szCs w:val="26"/>
+          <w:lang w:val="en-US"/>
+        </w:rPr>
+        <w:t xml:space="preserve"> </w:t>
+      </w:r>
+      <w:proofErr w:type="spellStart"/>
+      <w:r>
+        <w:rPr>
+          <w:rFonts w:asciiTheme="majorHAnsi" w:hAnsiTheme="majorHAnsi" w:cstheme="majorHAnsi"/>
+          <w:sz w:val="26"/>
+          <w:szCs w:val="26"/>
+          <w:lang w:val="en-US"/>
+        </w:rPr>
+        <w:t>xem</w:t>
       </w:r>
       <w:proofErr w:type="spellEnd"/>
       <w:r>
@@ -11411,87 +11451,27 @@
           <w:szCs w:val="26"/>
           <w:lang w:val="en-US"/>
         </w:rPr>
-        <w:t>hỗ</w:t>
-      </w:r>
-      <w:proofErr w:type="spellEnd"/>
-      <w:r>
-        <w:rPr>
-          <w:rFonts w:asciiTheme="majorHAnsi" w:hAnsiTheme="majorHAnsi" w:cstheme="majorHAnsi"/>
-          <w:sz w:val="26"/>
-          <w:szCs w:val="26"/>
-          <w:lang w:val="en-US"/>
-        </w:rPr>
-        <w:t xml:space="preserve"> </w:t>
-      </w:r>
-      <w:proofErr w:type="spellStart"/>
-      <w:r>
-        <w:rPr>
-          <w:rFonts w:asciiTheme="majorHAnsi" w:hAnsiTheme="majorHAnsi" w:cstheme="majorHAnsi"/>
-          <w:sz w:val="26"/>
-          <w:szCs w:val="26"/>
-          <w:lang w:val="en-US"/>
-        </w:rPr>
-        <w:t>trợ</w:t>
-      </w:r>
-      <w:proofErr w:type="spellEnd"/>
-      <w:r>
-        <w:rPr>
-          <w:rFonts w:asciiTheme="majorHAnsi" w:hAnsiTheme="majorHAnsi" w:cstheme="majorHAnsi"/>
-          <w:sz w:val="26"/>
-          <w:szCs w:val="26"/>
-          <w:lang w:val="en-US"/>
-        </w:rPr>
-        <w:t xml:space="preserve"> </w:t>
-      </w:r>
-      <w:proofErr w:type="spellStart"/>
-      <w:r>
-        <w:rPr>
-          <w:rFonts w:asciiTheme="majorHAnsi" w:hAnsiTheme="majorHAnsi" w:cstheme="majorHAnsi"/>
-          <w:sz w:val="26"/>
-          <w:szCs w:val="26"/>
-          <w:lang w:val="en-US"/>
-        </w:rPr>
-        <w:t>đa</w:t>
-      </w:r>
-      <w:proofErr w:type="spellEnd"/>
-      <w:r>
-        <w:rPr>
-          <w:rFonts w:asciiTheme="majorHAnsi" w:hAnsiTheme="majorHAnsi" w:cstheme="majorHAnsi"/>
-          <w:sz w:val="26"/>
-          <w:szCs w:val="26"/>
-          <w:lang w:val="en-US"/>
-        </w:rPr>
-        <w:t xml:space="preserve"> </w:t>
-      </w:r>
-      <w:proofErr w:type="spellStart"/>
-      <w:r>
-        <w:rPr>
-          <w:rFonts w:asciiTheme="majorHAnsi" w:hAnsiTheme="majorHAnsi" w:cstheme="majorHAnsi"/>
-          <w:sz w:val="26"/>
-          <w:szCs w:val="26"/>
-          <w:lang w:val="en-US"/>
-        </w:rPr>
-        <w:t>nền</w:t>
-      </w:r>
-      <w:proofErr w:type="spellEnd"/>
-      <w:r>
-        <w:rPr>
-          <w:rFonts w:asciiTheme="majorHAnsi" w:hAnsiTheme="majorHAnsi" w:cstheme="majorHAnsi"/>
-          <w:sz w:val="26"/>
-          <w:szCs w:val="26"/>
-          <w:lang w:val="en-US"/>
-        </w:rPr>
-        <w:t xml:space="preserve"> </w:t>
-      </w:r>
-      <w:proofErr w:type="spellStart"/>
-      <w:r>
-        <w:rPr>
-          <w:rFonts w:asciiTheme="majorHAnsi" w:hAnsiTheme="majorHAnsi" w:cstheme="majorHAnsi"/>
-          <w:sz w:val="26"/>
-          <w:szCs w:val="26"/>
-          <w:lang w:val="en-US"/>
-        </w:rPr>
-        <w:t>tảng</w:t>
+        <w:t>tìm</w:t>
+      </w:r>
+      <w:proofErr w:type="spellEnd"/>
+      <w:r>
+        <w:rPr>
+          <w:rFonts w:asciiTheme="majorHAnsi" w:hAnsiTheme="majorHAnsi" w:cstheme="majorHAnsi"/>
+          <w:sz w:val="26"/>
+          <w:szCs w:val="26"/>
+          <w:lang w:val="en-US"/>
+        </w:rPr>
+        <w:t xml:space="preserve"> </w:t>
+      </w:r>
+      <w:proofErr w:type="spellStart"/>
+      <w:r>
+        <w:rPr>
+          <w:rFonts w:asciiTheme="majorHAnsi" w:hAnsiTheme="majorHAnsi" w:cstheme="majorHAnsi"/>
+          <w:sz w:val="26"/>
+          <w:szCs w:val="26"/>
+          <w:lang w:val="en-US"/>
+        </w:rPr>
+        <w:t>kiếm</w:t>
       </w:r>
       <w:proofErr w:type="spellEnd"/>
       <w:r>
@@ -11531,138 +11511,149 @@
           <w:szCs w:val="26"/>
           <w:lang w:val="en-US"/>
         </w:rPr>
-        <w:t>đáp</w:t>
-      </w:r>
-      <w:proofErr w:type="spellEnd"/>
-      <w:r>
-        <w:rPr>
-          <w:rFonts w:asciiTheme="majorHAnsi" w:hAnsiTheme="majorHAnsi" w:cstheme="majorHAnsi"/>
-          <w:sz w:val="26"/>
-          <w:szCs w:val="26"/>
-          <w:lang w:val="en-US"/>
-        </w:rPr>
-        <w:t xml:space="preserve"> </w:t>
-      </w:r>
-      <w:proofErr w:type="spellStart"/>
-      <w:r>
-        <w:rPr>
-          <w:rFonts w:asciiTheme="majorHAnsi" w:hAnsiTheme="majorHAnsi" w:cstheme="majorHAnsi"/>
-          <w:sz w:val="26"/>
-          <w:szCs w:val="26"/>
-          <w:lang w:val="en-US"/>
-        </w:rPr>
-        <w:t>ứng</w:t>
-      </w:r>
-      <w:proofErr w:type="spellEnd"/>
-      <w:r>
-        <w:rPr>
-          <w:rFonts w:asciiTheme="majorHAnsi" w:hAnsiTheme="majorHAnsi" w:cstheme="majorHAnsi"/>
-          <w:sz w:val="26"/>
-          <w:szCs w:val="26"/>
-          <w:lang w:val="en-US"/>
-        </w:rPr>
-        <w:t xml:space="preserve"> </w:t>
-      </w:r>
-      <w:proofErr w:type="spellStart"/>
-      <w:r>
-        <w:rPr>
-          <w:rFonts w:asciiTheme="majorHAnsi" w:hAnsiTheme="majorHAnsi" w:cstheme="majorHAnsi"/>
-          <w:sz w:val="26"/>
-          <w:szCs w:val="26"/>
-          <w:lang w:val="en-US"/>
-        </w:rPr>
-        <w:t>khoảng</w:t>
-      </w:r>
-      <w:proofErr w:type="spellEnd"/>
-      <w:r>
-        <w:rPr>
-          <w:rFonts w:asciiTheme="majorHAnsi" w:hAnsiTheme="majorHAnsi" w:cstheme="majorHAnsi"/>
-          <w:sz w:val="26"/>
-          <w:szCs w:val="26"/>
-          <w:lang w:val="en-US"/>
-        </w:rPr>
-        <w:t xml:space="preserve"> 100–200 </w:t>
-      </w:r>
-      <w:proofErr w:type="spellStart"/>
-      <w:r>
-        <w:rPr>
-          <w:rFonts w:asciiTheme="majorHAnsi" w:hAnsiTheme="majorHAnsi" w:cstheme="majorHAnsi"/>
-          <w:sz w:val="26"/>
-          <w:szCs w:val="26"/>
-          <w:lang w:val="en-US"/>
-        </w:rPr>
-        <w:t>người</w:t>
-      </w:r>
-      <w:proofErr w:type="spellEnd"/>
-      <w:r>
-        <w:rPr>
-          <w:rFonts w:asciiTheme="majorHAnsi" w:hAnsiTheme="majorHAnsi" w:cstheme="majorHAnsi"/>
-          <w:sz w:val="26"/>
-          <w:szCs w:val="26"/>
-          <w:lang w:val="en-US"/>
-        </w:rPr>
-        <w:t xml:space="preserve"> </w:t>
-      </w:r>
-      <w:proofErr w:type="spellStart"/>
-      <w:r>
-        <w:rPr>
-          <w:rFonts w:asciiTheme="majorHAnsi" w:hAnsiTheme="majorHAnsi" w:cstheme="majorHAnsi"/>
-          <w:sz w:val="26"/>
-          <w:szCs w:val="26"/>
-          <w:lang w:val="en-US"/>
-        </w:rPr>
-        <w:t>dùng</w:t>
-      </w:r>
-      <w:proofErr w:type="spellEnd"/>
-      <w:r>
-        <w:rPr>
-          <w:rFonts w:asciiTheme="majorHAnsi" w:hAnsiTheme="majorHAnsi" w:cstheme="majorHAnsi"/>
-          <w:sz w:val="26"/>
-          <w:szCs w:val="26"/>
-          <w:lang w:val="en-US"/>
-        </w:rPr>
-        <w:t xml:space="preserve"> </w:t>
-      </w:r>
-      <w:proofErr w:type="spellStart"/>
-      <w:r>
-        <w:rPr>
-          <w:rFonts w:asciiTheme="majorHAnsi" w:hAnsiTheme="majorHAnsi" w:cstheme="majorHAnsi"/>
-          <w:sz w:val="26"/>
-          <w:szCs w:val="26"/>
-          <w:lang w:val="en-US"/>
-        </w:rPr>
-        <w:t>đồng</w:t>
-      </w:r>
-      <w:proofErr w:type="spellEnd"/>
-      <w:r>
-        <w:rPr>
-          <w:rFonts w:asciiTheme="majorHAnsi" w:hAnsiTheme="majorHAnsi" w:cstheme="majorHAnsi"/>
-          <w:sz w:val="26"/>
-          <w:szCs w:val="26"/>
-          <w:lang w:val="en-US"/>
-        </w:rPr>
-        <w:t xml:space="preserve"> </w:t>
-      </w:r>
-      <w:proofErr w:type="spellStart"/>
-      <w:r>
-        <w:rPr>
-          <w:rFonts w:asciiTheme="majorHAnsi" w:hAnsiTheme="majorHAnsi" w:cstheme="majorHAnsi"/>
-          <w:sz w:val="26"/>
-          <w:szCs w:val="26"/>
-          <w:lang w:val="en-US"/>
-        </w:rPr>
-        <w:t>thời</w:t>
-      </w:r>
-      <w:proofErr w:type="spellEnd"/>
-      <w:r>
-        <w:rPr>
-          <w:rFonts w:asciiTheme="majorHAnsi" w:hAnsiTheme="majorHAnsi" w:cstheme="majorHAnsi"/>
-          <w:sz w:val="26"/>
-          <w:szCs w:val="26"/>
-          <w:lang w:val="en-US"/>
-        </w:rPr>
-        <w:t>.</w:t>
-      </w:r>
+        <w:t>lựa</w:t>
+      </w:r>
+      <w:proofErr w:type="spellEnd"/>
+      <w:r>
+        <w:rPr>
+          <w:rFonts w:asciiTheme="majorHAnsi" w:hAnsiTheme="majorHAnsi" w:cstheme="majorHAnsi"/>
+          <w:sz w:val="26"/>
+          <w:szCs w:val="26"/>
+          <w:lang w:val="en-US"/>
+        </w:rPr>
+        <w:t xml:space="preserve"> </w:t>
+      </w:r>
+      <w:proofErr w:type="spellStart"/>
+      <w:r>
+        <w:rPr>
+          <w:rFonts w:asciiTheme="majorHAnsi" w:hAnsiTheme="majorHAnsi" w:cstheme="majorHAnsi"/>
+          <w:sz w:val="26"/>
+          <w:szCs w:val="26"/>
+          <w:lang w:val="en-US"/>
+        </w:rPr>
+        <w:t>chọn</w:t>
+      </w:r>
+      <w:proofErr w:type="spellEnd"/>
+      <w:r>
+        <w:rPr>
+          <w:rFonts w:asciiTheme="majorHAnsi" w:hAnsiTheme="majorHAnsi" w:cstheme="majorHAnsi"/>
+          <w:sz w:val="26"/>
+          <w:szCs w:val="26"/>
+          <w:lang w:val="en-US"/>
+        </w:rPr>
+        <w:t xml:space="preserve"> album </w:t>
+      </w:r>
+      <w:proofErr w:type="spellStart"/>
+      <w:r>
+        <w:rPr>
+          <w:rFonts w:asciiTheme="majorHAnsi" w:hAnsiTheme="majorHAnsi" w:cstheme="majorHAnsi"/>
+          <w:sz w:val="26"/>
+          <w:szCs w:val="26"/>
+          <w:lang w:val="en-US"/>
+        </w:rPr>
+        <w:t>và</w:t>
+      </w:r>
+      <w:proofErr w:type="spellEnd"/>
+      <w:r>
+        <w:rPr>
+          <w:rFonts w:asciiTheme="majorHAnsi" w:hAnsiTheme="majorHAnsi" w:cstheme="majorHAnsi"/>
+          <w:sz w:val="26"/>
+          <w:szCs w:val="26"/>
+          <w:lang w:val="en-US"/>
+        </w:rPr>
+        <w:t xml:space="preserve"> </w:t>
+      </w:r>
+      <w:proofErr w:type="spellStart"/>
+      <w:r>
+        <w:rPr>
+          <w:rFonts w:asciiTheme="majorHAnsi" w:hAnsiTheme="majorHAnsi" w:cstheme="majorHAnsi"/>
+          <w:sz w:val="26"/>
+          <w:szCs w:val="26"/>
+          <w:lang w:val="en-US"/>
+        </w:rPr>
+        <w:t>nhạc</w:t>
+      </w:r>
+      <w:proofErr w:type="spellEnd"/>
+      <w:r>
+        <w:rPr>
+          <w:rFonts w:asciiTheme="majorHAnsi" w:hAnsiTheme="majorHAnsi" w:cstheme="majorHAnsi"/>
+          <w:sz w:val="26"/>
+          <w:szCs w:val="26"/>
+          <w:lang w:val="en-US"/>
+        </w:rPr>
+        <w:t xml:space="preserve"> </w:t>
+      </w:r>
+      <w:proofErr w:type="spellStart"/>
+      <w:r>
+        <w:rPr>
+          <w:rFonts w:asciiTheme="majorHAnsi" w:hAnsiTheme="majorHAnsi" w:cstheme="majorHAnsi"/>
+          <w:sz w:val="26"/>
+          <w:szCs w:val="26"/>
+          <w:lang w:val="en-US"/>
+        </w:rPr>
+        <w:t>một</w:t>
+      </w:r>
+      <w:proofErr w:type="spellEnd"/>
+      <w:r>
+        <w:rPr>
+          <w:rFonts w:asciiTheme="majorHAnsi" w:hAnsiTheme="majorHAnsi" w:cstheme="majorHAnsi"/>
+          <w:sz w:val="26"/>
+          <w:szCs w:val="26"/>
+          <w:lang w:val="en-US"/>
+        </w:rPr>
+        <w:t xml:space="preserve"> </w:t>
+      </w:r>
+      <w:proofErr w:type="spellStart"/>
+      <w:r>
+        <w:rPr>
+          <w:rFonts w:asciiTheme="majorHAnsi" w:hAnsiTheme="majorHAnsi" w:cstheme="majorHAnsi"/>
+          <w:sz w:val="26"/>
+          <w:szCs w:val="26"/>
+          <w:lang w:val="en-US"/>
+        </w:rPr>
+        <w:t>cách</w:t>
+      </w:r>
+      <w:proofErr w:type="spellEnd"/>
+      <w:r>
+        <w:rPr>
+          <w:rFonts w:asciiTheme="majorHAnsi" w:hAnsiTheme="majorHAnsi" w:cstheme="majorHAnsi"/>
+          <w:sz w:val="26"/>
+          <w:szCs w:val="26"/>
+          <w:lang w:val="en-US"/>
+        </w:rPr>
+        <w:t xml:space="preserve"> </w:t>
+      </w:r>
+      <w:proofErr w:type="spellStart"/>
+      <w:r>
+        <w:rPr>
+          <w:rFonts w:asciiTheme="majorHAnsi" w:hAnsiTheme="majorHAnsi" w:cstheme="majorHAnsi"/>
+          <w:sz w:val="26"/>
+          <w:szCs w:val="26"/>
+          <w:lang w:val="en-US"/>
+        </w:rPr>
+        <w:t>thuận</w:t>
+      </w:r>
+      <w:proofErr w:type="spellEnd"/>
+      <w:r>
+        <w:rPr>
+          <w:rFonts w:asciiTheme="majorHAnsi" w:hAnsiTheme="majorHAnsi" w:cstheme="majorHAnsi"/>
+          <w:sz w:val="26"/>
+          <w:szCs w:val="26"/>
+          <w:lang w:val="en-US"/>
+        </w:rPr>
+        <w:t xml:space="preserve"> </w:t>
+      </w:r>
+      <w:proofErr w:type="spellStart"/>
+      <w:r>
+        <w:rPr>
+          <w:rFonts w:asciiTheme="majorHAnsi" w:hAnsiTheme="majorHAnsi" w:cstheme="majorHAnsi"/>
+          <w:sz w:val="26"/>
+          <w:szCs w:val="26"/>
+          <w:lang w:val="en-US"/>
+        </w:rPr>
+        <w:t>tiện</w:t>
+      </w:r>
+      <w:proofErr w:type="spellEnd"/>
     </w:p>
     <w:p>
       <w:pPr>
@@ -12299,225 +12290,31 @@
         </w:rPr>
         <w:t xml:space="preserve">- </w:t>
       </w:r>
-      <w:proofErr w:type="spellStart"/>
-      <w:r>
-        <w:rPr>
-          <w:rFonts w:asciiTheme="majorHAnsi" w:hAnsiTheme="majorHAnsi" w:cstheme="majorHAnsi"/>
-          <w:sz w:val="26"/>
-          <w:szCs w:val="26"/>
-          <w:lang w:val="en-US"/>
-        </w:rPr>
-        <w:t>Phân</w:t>
-      </w:r>
-      <w:proofErr w:type="spellEnd"/>
-      <w:r>
-        <w:rPr>
-          <w:rFonts w:asciiTheme="majorHAnsi" w:hAnsiTheme="majorHAnsi" w:cstheme="majorHAnsi"/>
-          <w:sz w:val="26"/>
-          <w:szCs w:val="26"/>
-          <w:lang w:val="en-US"/>
-        </w:rPr>
-        <w:t xml:space="preserve"> </w:t>
-      </w:r>
-      <w:proofErr w:type="spellStart"/>
-      <w:r>
-        <w:rPr>
-          <w:rFonts w:asciiTheme="majorHAnsi" w:hAnsiTheme="majorHAnsi" w:cstheme="majorHAnsi"/>
-          <w:sz w:val="26"/>
-          <w:szCs w:val="26"/>
-          <w:lang w:val="en-US"/>
-        </w:rPr>
-        <w:t>tích</w:t>
-      </w:r>
-      <w:proofErr w:type="spellEnd"/>
-      <w:r>
-        <w:rPr>
-          <w:rFonts w:asciiTheme="majorHAnsi" w:hAnsiTheme="majorHAnsi" w:cstheme="majorHAnsi"/>
-          <w:sz w:val="26"/>
-          <w:szCs w:val="26"/>
-          <w:lang w:val="en-US"/>
-        </w:rPr>
-        <w:t xml:space="preserve"> </w:t>
-      </w:r>
-      <w:proofErr w:type="spellStart"/>
-      <w:r>
-        <w:rPr>
-          <w:rFonts w:asciiTheme="majorHAnsi" w:hAnsiTheme="majorHAnsi" w:cstheme="majorHAnsi"/>
-          <w:sz w:val="26"/>
-          <w:szCs w:val="26"/>
-          <w:lang w:val="en-US"/>
-        </w:rPr>
-        <w:t>và</w:t>
-      </w:r>
-      <w:proofErr w:type="spellEnd"/>
-      <w:r>
-        <w:rPr>
-          <w:rFonts w:asciiTheme="majorHAnsi" w:hAnsiTheme="majorHAnsi" w:cstheme="majorHAnsi"/>
-          <w:sz w:val="26"/>
-          <w:szCs w:val="26"/>
-          <w:lang w:val="en-US"/>
-        </w:rPr>
-        <w:t xml:space="preserve"> </w:t>
-      </w:r>
-      <w:proofErr w:type="spellStart"/>
-      <w:r>
-        <w:rPr>
-          <w:rFonts w:asciiTheme="majorHAnsi" w:hAnsiTheme="majorHAnsi" w:cstheme="majorHAnsi"/>
-          <w:sz w:val="26"/>
-          <w:szCs w:val="26"/>
-          <w:lang w:val="en-US"/>
-        </w:rPr>
-        <w:t>thiết</w:t>
-      </w:r>
-      <w:proofErr w:type="spellEnd"/>
-      <w:r>
-        <w:rPr>
-          <w:rFonts w:asciiTheme="majorHAnsi" w:hAnsiTheme="majorHAnsi" w:cstheme="majorHAnsi"/>
-          <w:sz w:val="26"/>
-          <w:szCs w:val="26"/>
-          <w:lang w:val="en-US"/>
-        </w:rPr>
-        <w:t xml:space="preserve"> </w:t>
-      </w:r>
-      <w:proofErr w:type="spellStart"/>
-      <w:r>
-        <w:rPr>
-          <w:rFonts w:asciiTheme="majorHAnsi" w:hAnsiTheme="majorHAnsi" w:cstheme="majorHAnsi"/>
-          <w:sz w:val="26"/>
-          <w:szCs w:val="26"/>
-          <w:lang w:val="en-US"/>
-        </w:rPr>
-        <w:t>kế</w:t>
-      </w:r>
-      <w:proofErr w:type="spellEnd"/>
-      <w:r>
-        <w:rPr>
-          <w:rFonts w:asciiTheme="majorHAnsi" w:hAnsiTheme="majorHAnsi" w:cstheme="majorHAnsi"/>
-          <w:sz w:val="26"/>
-          <w:szCs w:val="26"/>
-          <w:lang w:val="en-US"/>
-        </w:rPr>
-        <w:t xml:space="preserve"> CSDL </w:t>
-      </w:r>
-      <w:proofErr w:type="spellStart"/>
-      <w:r>
-        <w:rPr>
-          <w:rFonts w:asciiTheme="majorHAnsi" w:hAnsiTheme="majorHAnsi" w:cstheme="majorHAnsi"/>
-          <w:sz w:val="26"/>
-          <w:szCs w:val="26"/>
-          <w:lang w:val="en-US"/>
-        </w:rPr>
-        <w:t>quản</w:t>
-      </w:r>
-      <w:proofErr w:type="spellEnd"/>
-      <w:r>
-        <w:rPr>
-          <w:rFonts w:asciiTheme="majorHAnsi" w:hAnsiTheme="majorHAnsi" w:cstheme="majorHAnsi"/>
-          <w:sz w:val="26"/>
-          <w:szCs w:val="26"/>
-          <w:lang w:val="en-US"/>
-        </w:rPr>
-        <w:t xml:space="preserve"> </w:t>
-      </w:r>
-      <w:proofErr w:type="spellStart"/>
-      <w:r>
-        <w:rPr>
-          <w:rFonts w:asciiTheme="majorHAnsi" w:hAnsiTheme="majorHAnsi" w:cstheme="majorHAnsi"/>
-          <w:sz w:val="26"/>
-          <w:szCs w:val="26"/>
-          <w:lang w:val="en-US"/>
-        </w:rPr>
-        <w:t>lý</w:t>
-      </w:r>
-      <w:proofErr w:type="spellEnd"/>
-      <w:r>
-        <w:rPr>
-          <w:rFonts w:asciiTheme="majorHAnsi" w:hAnsiTheme="majorHAnsi" w:cstheme="majorHAnsi"/>
-          <w:sz w:val="26"/>
-          <w:szCs w:val="26"/>
-          <w:lang w:val="en-US"/>
-        </w:rPr>
-        <w:t xml:space="preserve"> [</w:t>
-      </w:r>
-      <w:proofErr w:type="spellStart"/>
-      <w:r>
-        <w:rPr>
-          <w:rFonts w:asciiTheme="majorHAnsi" w:hAnsiTheme="majorHAnsi" w:cstheme="majorHAnsi"/>
-          <w:sz w:val="26"/>
-          <w:szCs w:val="26"/>
-          <w:lang w:val="en-US"/>
-        </w:rPr>
-        <w:t>Nghệ</w:t>
-      </w:r>
-      <w:proofErr w:type="spellEnd"/>
-      <w:r>
-        <w:rPr>
-          <w:rFonts w:asciiTheme="majorHAnsi" w:hAnsiTheme="majorHAnsi" w:cstheme="majorHAnsi"/>
-          <w:sz w:val="26"/>
-          <w:szCs w:val="26"/>
-          <w:lang w:val="en-US"/>
-        </w:rPr>
-        <w:t xml:space="preserve"> </w:t>
-      </w:r>
-      <w:proofErr w:type="spellStart"/>
-      <w:r>
-        <w:rPr>
-          <w:rFonts w:asciiTheme="majorHAnsi" w:hAnsiTheme="majorHAnsi" w:cstheme="majorHAnsi"/>
-          <w:sz w:val="26"/>
-          <w:szCs w:val="26"/>
-          <w:lang w:val="en-US"/>
-        </w:rPr>
-        <w:t>sĩ</w:t>
-      </w:r>
-      <w:proofErr w:type="spellEnd"/>
-      <w:r>
-        <w:rPr>
-          <w:rFonts w:asciiTheme="majorHAnsi" w:hAnsiTheme="majorHAnsi" w:cstheme="majorHAnsi"/>
-          <w:sz w:val="26"/>
-          <w:szCs w:val="26"/>
-          <w:lang w:val="en-US"/>
-        </w:rPr>
-        <w:t xml:space="preserve">, Album, </w:t>
-      </w:r>
-      <w:proofErr w:type="spellStart"/>
-      <w:r>
-        <w:rPr>
-          <w:rFonts w:asciiTheme="majorHAnsi" w:hAnsiTheme="majorHAnsi" w:cstheme="majorHAnsi"/>
-          <w:sz w:val="26"/>
-          <w:szCs w:val="26"/>
-          <w:lang w:val="en-US"/>
-        </w:rPr>
-        <w:t>Bài</w:t>
-      </w:r>
-      <w:proofErr w:type="spellEnd"/>
-      <w:r>
-        <w:rPr>
-          <w:rFonts w:asciiTheme="majorHAnsi" w:hAnsiTheme="majorHAnsi" w:cstheme="majorHAnsi"/>
-          <w:sz w:val="26"/>
-          <w:szCs w:val="26"/>
-          <w:lang w:val="en-US"/>
-        </w:rPr>
-        <w:t xml:space="preserve"> </w:t>
-      </w:r>
-      <w:proofErr w:type="spellStart"/>
-      <w:r>
-        <w:rPr>
-          <w:rFonts w:asciiTheme="majorHAnsi" w:hAnsiTheme="majorHAnsi" w:cstheme="majorHAnsi"/>
-          <w:sz w:val="26"/>
-          <w:szCs w:val="26"/>
-          <w:lang w:val="en-US"/>
-        </w:rPr>
-        <w:t>hát</w:t>
-      </w:r>
-      <w:proofErr w:type="spellEnd"/>
-      <w:r>
-        <w:rPr>
-          <w:rFonts w:asciiTheme="majorHAnsi" w:hAnsiTheme="majorHAnsi" w:cstheme="majorHAnsi"/>
-          <w:sz w:val="26"/>
-          <w:szCs w:val="26"/>
-          <w:lang w:val="en-US"/>
-        </w:rPr>
-        <w:t>].</w:t>
+      <w:r>
+        <w:rPr>
+          <w:rFonts w:asciiTheme="majorHAnsi" w:hAnsiTheme="majorHAnsi" w:cstheme="majorHAnsi"/>
+          <w:sz w:val="26"/>
+          <w:szCs w:val="26"/>
+        </w:rPr>
+        <w:t xml:space="preserve">Cho phép người dùng tìm kiếm, lọc và xem chi tiết thông </w:t>
+      </w:r>
+      <w:r>
+        <w:rPr>
+          <w:rFonts w:asciiTheme="majorHAnsi" w:hAnsiTheme="majorHAnsi" w:cstheme="majorHAnsi"/>
+          <w:sz w:val="26"/>
+          <w:szCs w:val="26"/>
+          <w:lang w:val="en-US"/>
+        </w:rPr>
+        <w:t>tin album.</w:t>
+      </w:r>
+      <w:r>
+        <w:rPr>
+          <w:rFonts w:asciiTheme="majorHAnsi" w:hAnsiTheme="majorHAnsi" w:cstheme="majorHAnsi"/>
+          <w:sz w:val="26"/>
+          <w:szCs w:val="26"/>
+          <w:lang w:val="en-US"/>
+        </w:rPr>
+        <w:t xml:space="preserve"> </w:t>
       </w:r>
     </w:p>
     <w:p>
@@ -12541,205 +12338,13 @@
         </w:rPr>
         <w:t xml:space="preserve">- </w:t>
       </w:r>
-      <w:proofErr w:type="spellStart"/>
-      <w:r>
-        <w:rPr>
-          <w:rFonts w:asciiTheme="majorHAnsi" w:hAnsiTheme="majorHAnsi" w:cstheme="majorHAnsi"/>
-          <w:sz w:val="26"/>
-          <w:szCs w:val="26"/>
-          <w:lang w:val="en-US"/>
-        </w:rPr>
-        <w:t>Xây</w:t>
-      </w:r>
-      <w:proofErr w:type="spellEnd"/>
-      <w:r>
-        <w:rPr>
-          <w:rFonts w:asciiTheme="majorHAnsi" w:hAnsiTheme="majorHAnsi" w:cstheme="majorHAnsi"/>
-          <w:sz w:val="26"/>
-          <w:szCs w:val="26"/>
-          <w:lang w:val="en-US"/>
-        </w:rPr>
-        <w:t xml:space="preserve"> </w:t>
-      </w:r>
-      <w:proofErr w:type="spellStart"/>
-      <w:r>
-        <w:rPr>
-          <w:rFonts w:asciiTheme="majorHAnsi" w:hAnsiTheme="majorHAnsi" w:cstheme="majorHAnsi"/>
-          <w:sz w:val="26"/>
-          <w:szCs w:val="26"/>
-          <w:lang w:val="en-US"/>
-        </w:rPr>
-        <w:t>dựng</w:t>
-      </w:r>
-      <w:proofErr w:type="spellEnd"/>
-      <w:r>
-        <w:rPr>
-          <w:rFonts w:asciiTheme="majorHAnsi" w:hAnsiTheme="majorHAnsi" w:cstheme="majorHAnsi"/>
-          <w:sz w:val="26"/>
-          <w:szCs w:val="26"/>
-          <w:lang w:val="en-US"/>
-        </w:rPr>
-        <w:t xml:space="preserve"> </w:t>
-      </w:r>
-      <w:proofErr w:type="spellStart"/>
-      <w:r>
-        <w:rPr>
-          <w:rFonts w:asciiTheme="majorHAnsi" w:hAnsiTheme="majorHAnsi" w:cstheme="majorHAnsi"/>
-          <w:sz w:val="26"/>
-          <w:szCs w:val="26"/>
-          <w:lang w:val="en-US"/>
-        </w:rPr>
-        <w:t>chức</w:t>
-      </w:r>
-      <w:proofErr w:type="spellEnd"/>
-      <w:r>
-        <w:rPr>
-          <w:rFonts w:asciiTheme="majorHAnsi" w:hAnsiTheme="majorHAnsi" w:cstheme="majorHAnsi"/>
-          <w:sz w:val="26"/>
-          <w:szCs w:val="26"/>
-          <w:lang w:val="en-US"/>
-        </w:rPr>
-        <w:t xml:space="preserve"> </w:t>
-      </w:r>
-      <w:proofErr w:type="spellStart"/>
-      <w:r>
-        <w:rPr>
-          <w:rFonts w:asciiTheme="majorHAnsi" w:hAnsiTheme="majorHAnsi" w:cstheme="majorHAnsi"/>
-          <w:sz w:val="26"/>
-          <w:szCs w:val="26"/>
-          <w:lang w:val="en-US"/>
-        </w:rPr>
-        <w:t>năng</w:t>
-      </w:r>
-      <w:proofErr w:type="spellEnd"/>
-      <w:r>
-        <w:rPr>
-          <w:rFonts w:asciiTheme="majorHAnsi" w:hAnsiTheme="majorHAnsi" w:cstheme="majorHAnsi"/>
-          <w:sz w:val="26"/>
-          <w:szCs w:val="26"/>
-          <w:lang w:val="en-US"/>
-        </w:rPr>
-        <w:t xml:space="preserve"> Streaming </w:t>
-      </w:r>
-      <w:proofErr w:type="spellStart"/>
-      <w:r>
-        <w:rPr>
-          <w:rFonts w:asciiTheme="majorHAnsi" w:hAnsiTheme="majorHAnsi" w:cstheme="majorHAnsi"/>
-          <w:sz w:val="26"/>
-          <w:szCs w:val="26"/>
-          <w:lang w:val="en-US"/>
-        </w:rPr>
-        <w:t>nhạc</w:t>
-      </w:r>
-      <w:proofErr w:type="spellEnd"/>
-      <w:r>
-        <w:rPr>
-          <w:rFonts w:asciiTheme="majorHAnsi" w:hAnsiTheme="majorHAnsi" w:cstheme="majorHAnsi"/>
-          <w:sz w:val="26"/>
-          <w:szCs w:val="26"/>
-          <w:lang w:val="en-US"/>
-        </w:rPr>
-        <w:t xml:space="preserve"> </w:t>
-      </w:r>
-      <w:proofErr w:type="spellStart"/>
-      <w:r>
-        <w:rPr>
-          <w:rFonts w:asciiTheme="majorHAnsi" w:hAnsiTheme="majorHAnsi" w:cstheme="majorHAnsi"/>
-          <w:sz w:val="26"/>
-          <w:szCs w:val="26"/>
-          <w:lang w:val="en-US"/>
-        </w:rPr>
-        <w:t>ổn</w:t>
-      </w:r>
-      <w:proofErr w:type="spellEnd"/>
-      <w:r>
-        <w:rPr>
-          <w:rFonts w:asciiTheme="majorHAnsi" w:hAnsiTheme="majorHAnsi" w:cstheme="majorHAnsi"/>
-          <w:sz w:val="26"/>
-          <w:szCs w:val="26"/>
-          <w:lang w:val="en-US"/>
-        </w:rPr>
-        <w:t xml:space="preserve"> </w:t>
-      </w:r>
-      <w:proofErr w:type="spellStart"/>
-      <w:r>
-        <w:rPr>
-          <w:rFonts w:asciiTheme="majorHAnsi" w:hAnsiTheme="majorHAnsi" w:cstheme="majorHAnsi"/>
-          <w:sz w:val="26"/>
-          <w:szCs w:val="26"/>
-          <w:lang w:val="en-US"/>
-        </w:rPr>
-        <w:t>định</w:t>
-      </w:r>
-      <w:proofErr w:type="spellEnd"/>
-      <w:r>
-        <w:rPr>
-          <w:rFonts w:asciiTheme="majorHAnsi" w:hAnsiTheme="majorHAnsi" w:cstheme="majorHAnsi"/>
-          <w:sz w:val="26"/>
-          <w:szCs w:val="26"/>
-          <w:lang w:val="en-US"/>
-        </w:rPr>
-        <w:t xml:space="preserve"> </w:t>
-      </w:r>
-      <w:proofErr w:type="spellStart"/>
-      <w:r>
-        <w:rPr>
-          <w:rFonts w:asciiTheme="majorHAnsi" w:hAnsiTheme="majorHAnsi" w:cstheme="majorHAnsi"/>
-          <w:sz w:val="26"/>
-          <w:szCs w:val="26"/>
-          <w:lang w:val="en-US"/>
-        </w:rPr>
-        <w:t>và</w:t>
-      </w:r>
-      <w:proofErr w:type="spellEnd"/>
-      <w:r>
-        <w:rPr>
-          <w:rFonts w:asciiTheme="majorHAnsi" w:hAnsiTheme="majorHAnsi" w:cstheme="majorHAnsi"/>
-          <w:sz w:val="26"/>
-          <w:szCs w:val="26"/>
-          <w:lang w:val="en-US"/>
-        </w:rPr>
-        <w:t xml:space="preserve"> </w:t>
-      </w:r>
-      <w:proofErr w:type="spellStart"/>
-      <w:r>
-        <w:rPr>
-          <w:rFonts w:asciiTheme="majorHAnsi" w:hAnsiTheme="majorHAnsi" w:cstheme="majorHAnsi"/>
-          <w:sz w:val="26"/>
-          <w:szCs w:val="26"/>
-          <w:lang w:val="en-US"/>
-        </w:rPr>
-        <w:t>nhanh</w:t>
-      </w:r>
-      <w:proofErr w:type="spellEnd"/>
-      <w:r>
-        <w:rPr>
-          <w:rFonts w:asciiTheme="majorHAnsi" w:hAnsiTheme="majorHAnsi" w:cstheme="majorHAnsi"/>
-          <w:sz w:val="26"/>
-          <w:szCs w:val="26"/>
-          <w:lang w:val="en-US"/>
-        </w:rPr>
-        <w:t xml:space="preserve"> </w:t>
-      </w:r>
-      <w:proofErr w:type="spellStart"/>
-      <w:r>
-        <w:rPr>
-          <w:rFonts w:asciiTheme="majorHAnsi" w:hAnsiTheme="majorHAnsi" w:cstheme="majorHAnsi"/>
-          <w:sz w:val="26"/>
-          <w:szCs w:val="26"/>
-          <w:lang w:val="en-US"/>
-        </w:rPr>
-        <w:t>chóng</w:t>
-      </w:r>
-      <w:proofErr w:type="spellEnd"/>
-      <w:r>
-        <w:rPr>
-          <w:rFonts w:asciiTheme="majorHAnsi" w:hAnsiTheme="majorHAnsi" w:cstheme="majorHAnsi"/>
-          <w:sz w:val="26"/>
-          <w:szCs w:val="26"/>
-          <w:lang w:val="en-US"/>
-        </w:rPr>
-        <w:t>.</w:t>
+      <w:r>
+        <w:rPr>
+          <w:rFonts w:asciiTheme="majorHAnsi" w:hAnsiTheme="majorHAnsi" w:cstheme="majorHAnsi"/>
+          <w:sz w:val="26"/>
+          <w:szCs w:val="26"/>
+        </w:rPr>
+        <w:t>Hỗ trợ người dùng đăng ký, đăng nhập và quản lý thông tin cá nhân</w:t>
       </w:r>
     </w:p>
     <w:p>
@@ -12771,47 +12376,47 @@
           <w:szCs w:val="26"/>
           <w:lang w:val="en-US"/>
         </w:rPr>
-        <w:t>Triển</w:t>
-      </w:r>
-      <w:proofErr w:type="spellEnd"/>
-      <w:r>
-        <w:rPr>
-          <w:rFonts w:asciiTheme="majorHAnsi" w:hAnsiTheme="majorHAnsi" w:cstheme="majorHAnsi"/>
-          <w:sz w:val="26"/>
-          <w:szCs w:val="26"/>
-          <w:lang w:val="en-US"/>
-        </w:rPr>
-        <w:t xml:space="preserve"> </w:t>
-      </w:r>
-      <w:proofErr w:type="spellStart"/>
-      <w:r>
-        <w:rPr>
-          <w:rFonts w:asciiTheme="majorHAnsi" w:hAnsiTheme="majorHAnsi" w:cstheme="majorHAnsi"/>
-          <w:sz w:val="26"/>
-          <w:szCs w:val="26"/>
-          <w:lang w:val="en-US"/>
-        </w:rPr>
-        <w:t>khai</w:t>
-      </w:r>
-      <w:proofErr w:type="spellEnd"/>
-      <w:r>
-        <w:rPr>
-          <w:rFonts w:asciiTheme="majorHAnsi" w:hAnsiTheme="majorHAnsi" w:cstheme="majorHAnsi"/>
-          <w:sz w:val="26"/>
-          <w:szCs w:val="26"/>
-          <w:lang w:val="en-US"/>
-        </w:rPr>
-        <w:t xml:space="preserve"> </w:t>
-      </w:r>
-      <w:proofErr w:type="spellStart"/>
-      <w:r>
-        <w:rPr>
-          <w:rFonts w:asciiTheme="majorHAnsi" w:hAnsiTheme="majorHAnsi" w:cstheme="majorHAnsi"/>
-          <w:sz w:val="26"/>
-          <w:szCs w:val="26"/>
-          <w:lang w:val="en-US"/>
-        </w:rPr>
-        <w:t>chức</w:t>
+        <w:t>Phát</w:t>
+      </w:r>
+      <w:proofErr w:type="spellEnd"/>
+      <w:r>
+        <w:rPr>
+          <w:rFonts w:asciiTheme="majorHAnsi" w:hAnsiTheme="majorHAnsi" w:cstheme="majorHAnsi"/>
+          <w:sz w:val="26"/>
+          <w:szCs w:val="26"/>
+          <w:lang w:val="en-US"/>
+        </w:rPr>
+        <w:t xml:space="preserve"> </w:t>
+      </w:r>
+      <w:proofErr w:type="spellStart"/>
+      <w:r>
+        <w:rPr>
+          <w:rFonts w:asciiTheme="majorHAnsi" w:hAnsiTheme="majorHAnsi" w:cstheme="majorHAnsi"/>
+          <w:sz w:val="26"/>
+          <w:szCs w:val="26"/>
+          <w:lang w:val="en-US"/>
+        </w:rPr>
+        <w:t>triển</w:t>
+      </w:r>
+      <w:proofErr w:type="spellEnd"/>
+      <w:r>
+        <w:rPr>
+          <w:rFonts w:asciiTheme="majorHAnsi" w:hAnsiTheme="majorHAnsi" w:cstheme="majorHAnsi"/>
+          <w:sz w:val="26"/>
+          <w:szCs w:val="26"/>
+          <w:lang w:val="en-US"/>
+        </w:rPr>
+        <w:t xml:space="preserve"> </w:t>
+      </w:r>
+      <w:proofErr w:type="spellStart"/>
+      <w:r>
+        <w:rPr>
+          <w:rFonts w:asciiTheme="majorHAnsi" w:hAnsiTheme="majorHAnsi" w:cstheme="majorHAnsi"/>
+          <w:sz w:val="26"/>
+          <w:szCs w:val="26"/>
+          <w:lang w:val="en-US"/>
+        </w:rPr>
+        <w:t>tính</w:t>
       </w:r>
       <w:proofErr w:type="spellEnd"/>
       <w:r>
@@ -12841,97 +12446,57 @@
           <w:szCs w:val="26"/>
           <w:lang w:val="en-US"/>
         </w:rPr>
-        <w:t xml:space="preserve"> Tìm </w:t>
-      </w:r>
-      <w:proofErr w:type="spellStart"/>
-      <w:r>
-        <w:rPr>
-          <w:rFonts w:asciiTheme="majorHAnsi" w:hAnsiTheme="majorHAnsi" w:cstheme="majorHAnsi"/>
-          <w:sz w:val="26"/>
-          <w:szCs w:val="26"/>
-          <w:lang w:val="en-US"/>
-        </w:rPr>
-        <w:t>kiếm</w:t>
-      </w:r>
-      <w:proofErr w:type="spellEnd"/>
-      <w:r>
-        <w:rPr>
-          <w:rFonts w:asciiTheme="majorHAnsi" w:hAnsiTheme="majorHAnsi" w:cstheme="majorHAnsi"/>
-          <w:sz w:val="26"/>
-          <w:szCs w:val="26"/>
-          <w:lang w:val="en-US"/>
-        </w:rPr>
-        <w:t xml:space="preserve"> </w:t>
-      </w:r>
-      <w:proofErr w:type="spellStart"/>
-      <w:r>
-        <w:rPr>
-          <w:rFonts w:asciiTheme="majorHAnsi" w:hAnsiTheme="majorHAnsi" w:cstheme="majorHAnsi"/>
-          <w:sz w:val="26"/>
-          <w:szCs w:val="26"/>
-          <w:lang w:val="en-US"/>
-        </w:rPr>
-        <w:t>nâng</w:t>
-      </w:r>
-      <w:proofErr w:type="spellEnd"/>
-      <w:r>
-        <w:rPr>
-          <w:rFonts w:asciiTheme="majorHAnsi" w:hAnsiTheme="majorHAnsi" w:cstheme="majorHAnsi"/>
-          <w:sz w:val="26"/>
-          <w:szCs w:val="26"/>
-          <w:lang w:val="en-US"/>
-        </w:rPr>
-        <w:t xml:space="preserve"> </w:t>
-      </w:r>
-      <w:proofErr w:type="spellStart"/>
-      <w:r>
-        <w:rPr>
-          <w:rFonts w:asciiTheme="majorHAnsi" w:hAnsiTheme="majorHAnsi" w:cstheme="majorHAnsi"/>
-          <w:sz w:val="26"/>
-          <w:szCs w:val="26"/>
-          <w:lang w:val="en-US"/>
-        </w:rPr>
-        <w:t>cao</w:t>
-      </w:r>
-      <w:proofErr w:type="spellEnd"/>
-      <w:r>
-        <w:rPr>
-          <w:rFonts w:asciiTheme="majorHAnsi" w:hAnsiTheme="majorHAnsi" w:cstheme="majorHAnsi"/>
-          <w:sz w:val="26"/>
-          <w:szCs w:val="26"/>
-          <w:lang w:val="en-US"/>
-        </w:rPr>
-        <w:t xml:space="preserve"> (</w:t>
-      </w:r>
-      <w:proofErr w:type="spellStart"/>
-      <w:r>
-        <w:rPr>
-          <w:rFonts w:asciiTheme="majorHAnsi" w:hAnsiTheme="majorHAnsi" w:cstheme="majorHAnsi"/>
-          <w:sz w:val="26"/>
-          <w:szCs w:val="26"/>
-          <w:lang w:val="en-US"/>
-        </w:rPr>
-        <w:t>theo</w:t>
-      </w:r>
-      <w:proofErr w:type="spellEnd"/>
-      <w:r>
-        <w:rPr>
-          <w:rFonts w:asciiTheme="majorHAnsi" w:hAnsiTheme="majorHAnsi" w:cstheme="majorHAnsi"/>
-          <w:sz w:val="26"/>
-          <w:szCs w:val="26"/>
-          <w:lang w:val="en-US"/>
-        </w:rPr>
-        <w:t xml:space="preserve"> </w:t>
-      </w:r>
-      <w:proofErr w:type="spellStart"/>
-      <w:r>
-        <w:rPr>
-          <w:rFonts w:asciiTheme="majorHAnsi" w:hAnsiTheme="majorHAnsi" w:cstheme="majorHAnsi"/>
-          <w:sz w:val="26"/>
-          <w:szCs w:val="26"/>
-          <w:lang w:val="en-US"/>
-        </w:rPr>
-        <w:t>tên</w:t>
+        <w:t xml:space="preserve"> </w:t>
+      </w:r>
+      <w:proofErr w:type="spellStart"/>
+      <w:r>
+        <w:rPr>
+          <w:rFonts w:asciiTheme="majorHAnsi" w:hAnsiTheme="majorHAnsi" w:cstheme="majorHAnsi"/>
+          <w:sz w:val="26"/>
+          <w:szCs w:val="26"/>
+          <w:lang w:val="en-US"/>
+        </w:rPr>
+        <w:t>Tạo</w:t>
+      </w:r>
+      <w:proofErr w:type="spellEnd"/>
+      <w:r>
+        <w:rPr>
+          <w:rFonts w:asciiTheme="majorHAnsi" w:hAnsiTheme="majorHAnsi" w:cstheme="majorHAnsi"/>
+          <w:sz w:val="26"/>
+          <w:szCs w:val="26"/>
+          <w:lang w:val="en-US"/>
+        </w:rPr>
+        <w:t xml:space="preserve"> Playlist, </w:t>
+      </w:r>
+      <w:proofErr w:type="spellStart"/>
+      <w:r>
+        <w:rPr>
+          <w:rFonts w:asciiTheme="majorHAnsi" w:hAnsiTheme="majorHAnsi" w:cstheme="majorHAnsi"/>
+          <w:sz w:val="26"/>
+          <w:szCs w:val="26"/>
+          <w:lang w:val="en-US"/>
+        </w:rPr>
+        <w:t>Thêm</w:t>
+      </w:r>
+      <w:proofErr w:type="spellEnd"/>
+      <w:r>
+        <w:rPr>
+          <w:rFonts w:asciiTheme="majorHAnsi" w:hAnsiTheme="majorHAnsi" w:cstheme="majorHAnsi"/>
+          <w:sz w:val="26"/>
+          <w:szCs w:val="26"/>
+          <w:lang w:val="en-US"/>
+        </w:rPr>
+        <w:t>/</w:t>
+      </w:r>
+      <w:proofErr w:type="spellStart"/>
+      <w:r>
+        <w:rPr>
+          <w:rFonts w:asciiTheme="majorHAnsi" w:hAnsiTheme="majorHAnsi" w:cstheme="majorHAnsi"/>
+          <w:sz w:val="26"/>
+          <w:szCs w:val="26"/>
+          <w:lang w:val="en-US"/>
+        </w:rPr>
+        <w:t>Xóa</w:t>
       </w:r>
       <w:proofErr w:type="spellEnd"/>
       <w:r>
@@ -12981,47 +12546,47 @@
           <w:szCs w:val="26"/>
           <w:lang w:val="en-US"/>
         </w:rPr>
-        <w:t xml:space="preserve">, </w:t>
-      </w:r>
-      <w:proofErr w:type="spellStart"/>
-      <w:r>
-        <w:rPr>
-          <w:rFonts w:asciiTheme="majorHAnsi" w:hAnsiTheme="majorHAnsi" w:cstheme="majorHAnsi"/>
-          <w:sz w:val="26"/>
-          <w:szCs w:val="26"/>
-          <w:lang w:val="en-US"/>
-        </w:rPr>
-        <w:t>nghệ</w:t>
-      </w:r>
-      <w:proofErr w:type="spellEnd"/>
-      <w:r>
-        <w:rPr>
-          <w:rFonts w:asciiTheme="majorHAnsi" w:hAnsiTheme="majorHAnsi" w:cstheme="majorHAnsi"/>
-          <w:sz w:val="26"/>
-          <w:szCs w:val="26"/>
-          <w:lang w:val="en-US"/>
-        </w:rPr>
-        <w:t xml:space="preserve"> </w:t>
-      </w:r>
-      <w:proofErr w:type="spellStart"/>
-      <w:r>
-        <w:rPr>
-          <w:rFonts w:asciiTheme="majorHAnsi" w:hAnsiTheme="majorHAnsi" w:cstheme="majorHAnsi"/>
-          <w:sz w:val="26"/>
-          <w:szCs w:val="26"/>
-          <w:lang w:val="en-US"/>
-        </w:rPr>
-        <w:t>sĩ</w:t>
-      </w:r>
-      <w:proofErr w:type="spellEnd"/>
-      <w:r>
-        <w:rPr>
-          <w:rFonts w:asciiTheme="majorHAnsi" w:hAnsiTheme="majorHAnsi" w:cstheme="majorHAnsi"/>
-          <w:sz w:val="26"/>
-          <w:szCs w:val="26"/>
-          <w:lang w:val="en-US"/>
-        </w:rPr>
-        <w:t>, album).</w:t>
+        <w:t xml:space="preserve"> </w:t>
+      </w:r>
+      <w:proofErr w:type="spellStart"/>
+      <w:r>
+        <w:rPr>
+          <w:rFonts w:asciiTheme="majorHAnsi" w:hAnsiTheme="majorHAnsi" w:cstheme="majorHAnsi"/>
+          <w:sz w:val="26"/>
+          <w:szCs w:val="26"/>
+          <w:lang w:val="en-US"/>
+        </w:rPr>
+        <w:t>yêu</w:t>
+      </w:r>
+      <w:proofErr w:type="spellEnd"/>
+      <w:r>
+        <w:rPr>
+          <w:rFonts w:asciiTheme="majorHAnsi" w:hAnsiTheme="majorHAnsi" w:cstheme="majorHAnsi"/>
+          <w:sz w:val="26"/>
+          <w:szCs w:val="26"/>
+          <w:lang w:val="en-US"/>
+        </w:rPr>
+        <w:t xml:space="preserve"> </w:t>
+      </w:r>
+      <w:proofErr w:type="spellStart"/>
+      <w:r>
+        <w:rPr>
+          <w:rFonts w:asciiTheme="majorHAnsi" w:hAnsiTheme="majorHAnsi" w:cstheme="majorHAnsi"/>
+          <w:sz w:val="26"/>
+          <w:szCs w:val="26"/>
+          <w:lang w:val="en-US"/>
+        </w:rPr>
+        <w:t>thích</w:t>
+      </w:r>
+      <w:proofErr w:type="spellEnd"/>
+      <w:r>
+        <w:rPr>
+          <w:rFonts w:asciiTheme="majorHAnsi" w:hAnsiTheme="majorHAnsi" w:cstheme="majorHAnsi"/>
+          <w:sz w:val="26"/>
+          <w:szCs w:val="26"/>
+          <w:lang w:val="en-US"/>
+        </w:rPr>
+        <w:t>.</w:t>
       </w:r>
     </w:p>
     <w:p>
@@ -13053,137 +12618,157 @@
           <w:szCs w:val="26"/>
           <w:lang w:val="en-US"/>
         </w:rPr>
-        <w:t>Phát</w:t>
-      </w:r>
-      <w:proofErr w:type="spellEnd"/>
-      <w:r>
-        <w:rPr>
-          <w:rFonts w:asciiTheme="majorHAnsi" w:hAnsiTheme="majorHAnsi" w:cstheme="majorHAnsi"/>
-          <w:sz w:val="26"/>
-          <w:szCs w:val="26"/>
-          <w:lang w:val="en-US"/>
-        </w:rPr>
-        <w:t xml:space="preserve"> </w:t>
-      </w:r>
-      <w:proofErr w:type="spellStart"/>
-      <w:r>
-        <w:rPr>
-          <w:rFonts w:asciiTheme="majorHAnsi" w:hAnsiTheme="majorHAnsi" w:cstheme="majorHAnsi"/>
-          <w:sz w:val="26"/>
-          <w:szCs w:val="26"/>
-          <w:lang w:val="en-US"/>
-        </w:rPr>
-        <w:t>triển</w:t>
-      </w:r>
-      <w:proofErr w:type="spellEnd"/>
-      <w:r>
-        <w:rPr>
-          <w:rFonts w:asciiTheme="majorHAnsi" w:hAnsiTheme="majorHAnsi" w:cstheme="majorHAnsi"/>
-          <w:sz w:val="26"/>
-          <w:szCs w:val="26"/>
-          <w:lang w:val="en-US"/>
-        </w:rPr>
-        <w:t xml:space="preserve"> </w:t>
-      </w:r>
-      <w:proofErr w:type="spellStart"/>
-      <w:r>
-        <w:rPr>
-          <w:rFonts w:asciiTheme="majorHAnsi" w:hAnsiTheme="majorHAnsi" w:cstheme="majorHAnsi"/>
-          <w:sz w:val="26"/>
-          <w:szCs w:val="26"/>
-          <w:lang w:val="en-US"/>
-        </w:rPr>
-        <w:t>tính</w:t>
-      </w:r>
-      <w:proofErr w:type="spellEnd"/>
-      <w:r>
-        <w:rPr>
-          <w:rFonts w:asciiTheme="majorHAnsi" w:hAnsiTheme="majorHAnsi" w:cstheme="majorHAnsi"/>
-          <w:sz w:val="26"/>
-          <w:szCs w:val="26"/>
-          <w:lang w:val="en-US"/>
-        </w:rPr>
-        <w:t xml:space="preserve"> </w:t>
-      </w:r>
-      <w:proofErr w:type="spellStart"/>
-      <w:r>
-        <w:rPr>
-          <w:rFonts w:asciiTheme="majorHAnsi" w:hAnsiTheme="majorHAnsi" w:cstheme="majorHAnsi"/>
-          <w:sz w:val="26"/>
-          <w:szCs w:val="26"/>
-          <w:lang w:val="en-US"/>
-        </w:rPr>
-        <w:t>năng</w:t>
-      </w:r>
-      <w:proofErr w:type="spellEnd"/>
-      <w:r>
-        <w:rPr>
-          <w:rFonts w:asciiTheme="majorHAnsi" w:hAnsiTheme="majorHAnsi" w:cstheme="majorHAnsi"/>
-          <w:sz w:val="26"/>
-          <w:szCs w:val="26"/>
-          <w:lang w:val="en-US"/>
-        </w:rPr>
-        <w:t xml:space="preserve"> </w:t>
-      </w:r>
-      <w:proofErr w:type="spellStart"/>
-      <w:r>
-        <w:rPr>
-          <w:rFonts w:asciiTheme="majorHAnsi" w:hAnsiTheme="majorHAnsi" w:cstheme="majorHAnsi"/>
-          <w:sz w:val="26"/>
-          <w:szCs w:val="26"/>
-          <w:lang w:val="en-US"/>
-        </w:rPr>
-        <w:t>Tạo</w:t>
-      </w:r>
-      <w:proofErr w:type="spellEnd"/>
-      <w:r>
-        <w:rPr>
-          <w:rFonts w:asciiTheme="majorHAnsi" w:hAnsiTheme="majorHAnsi" w:cstheme="majorHAnsi"/>
-          <w:sz w:val="26"/>
-          <w:szCs w:val="26"/>
-          <w:lang w:val="en-US"/>
-        </w:rPr>
-        <w:t xml:space="preserve"> Playlist, </w:t>
-      </w:r>
-      <w:proofErr w:type="spellStart"/>
-      <w:r>
-        <w:rPr>
-          <w:rFonts w:asciiTheme="majorHAnsi" w:hAnsiTheme="majorHAnsi" w:cstheme="majorHAnsi"/>
-          <w:sz w:val="26"/>
-          <w:szCs w:val="26"/>
-          <w:lang w:val="en-US"/>
-        </w:rPr>
-        <w:t>Thêm</w:t>
-      </w:r>
-      <w:proofErr w:type="spellEnd"/>
-      <w:r>
-        <w:rPr>
-          <w:rFonts w:asciiTheme="majorHAnsi" w:hAnsiTheme="majorHAnsi" w:cstheme="majorHAnsi"/>
-          <w:sz w:val="26"/>
-          <w:szCs w:val="26"/>
-          <w:lang w:val="en-US"/>
-        </w:rPr>
-        <w:t>/</w:t>
-      </w:r>
-      <w:proofErr w:type="spellStart"/>
-      <w:r>
-        <w:rPr>
-          <w:rFonts w:asciiTheme="majorHAnsi" w:hAnsiTheme="majorHAnsi" w:cstheme="majorHAnsi"/>
-          <w:sz w:val="26"/>
-          <w:szCs w:val="26"/>
-          <w:lang w:val="en-US"/>
-        </w:rPr>
-        <w:t>Xóa</w:t>
-      </w:r>
-      <w:proofErr w:type="spellEnd"/>
-      <w:r>
-        <w:rPr>
-          <w:rFonts w:asciiTheme="majorHAnsi" w:hAnsiTheme="majorHAnsi" w:cstheme="majorHAnsi"/>
-          <w:sz w:val="26"/>
-          <w:szCs w:val="26"/>
-          <w:lang w:val="en-US"/>
-        </w:rPr>
-        <w:t xml:space="preserve"> </w:t>
+        <w:t>Hỗ</w:t>
+      </w:r>
+      <w:proofErr w:type="spellEnd"/>
+      <w:r>
+        <w:rPr>
+          <w:rFonts w:asciiTheme="majorHAnsi" w:hAnsiTheme="majorHAnsi" w:cstheme="majorHAnsi"/>
+          <w:sz w:val="26"/>
+          <w:szCs w:val="26"/>
+          <w:lang w:val="en-US"/>
+        </w:rPr>
+        <w:t xml:space="preserve"> </w:t>
+      </w:r>
+      <w:proofErr w:type="spellStart"/>
+      <w:r>
+        <w:rPr>
+          <w:rFonts w:asciiTheme="majorHAnsi" w:hAnsiTheme="majorHAnsi" w:cstheme="majorHAnsi"/>
+          <w:sz w:val="26"/>
+          <w:szCs w:val="26"/>
+          <w:lang w:val="en-US"/>
+        </w:rPr>
+        <w:t>trợ</w:t>
+      </w:r>
+      <w:proofErr w:type="spellEnd"/>
+      <w:r>
+        <w:rPr>
+          <w:rFonts w:asciiTheme="majorHAnsi" w:hAnsiTheme="majorHAnsi" w:cstheme="majorHAnsi"/>
+          <w:sz w:val="26"/>
+          <w:szCs w:val="26"/>
+          <w:lang w:val="en-US"/>
+        </w:rPr>
+        <w:t xml:space="preserve"> </w:t>
+      </w:r>
+      <w:proofErr w:type="spellStart"/>
+      <w:r>
+        <w:rPr>
+          <w:rFonts w:asciiTheme="majorHAnsi" w:hAnsiTheme="majorHAnsi" w:cstheme="majorHAnsi"/>
+          <w:sz w:val="26"/>
+          <w:szCs w:val="26"/>
+          <w:lang w:val="en-US"/>
+        </w:rPr>
+        <w:t>quản</w:t>
+      </w:r>
+      <w:proofErr w:type="spellEnd"/>
+      <w:r>
+        <w:rPr>
+          <w:rFonts w:asciiTheme="majorHAnsi" w:hAnsiTheme="majorHAnsi" w:cstheme="majorHAnsi"/>
+          <w:sz w:val="26"/>
+          <w:szCs w:val="26"/>
+          <w:lang w:val="en-US"/>
+        </w:rPr>
+        <w:t xml:space="preserve"> </w:t>
+      </w:r>
+      <w:proofErr w:type="spellStart"/>
+      <w:r>
+        <w:rPr>
+          <w:rFonts w:asciiTheme="majorHAnsi" w:hAnsiTheme="majorHAnsi" w:cstheme="majorHAnsi"/>
+          <w:sz w:val="26"/>
+          <w:szCs w:val="26"/>
+          <w:lang w:val="en-US"/>
+        </w:rPr>
+        <w:t>trị</w:t>
+      </w:r>
+      <w:proofErr w:type="spellEnd"/>
+      <w:r>
+        <w:rPr>
+          <w:rFonts w:asciiTheme="majorHAnsi" w:hAnsiTheme="majorHAnsi" w:cstheme="majorHAnsi"/>
+          <w:sz w:val="26"/>
+          <w:szCs w:val="26"/>
+          <w:lang w:val="en-US"/>
+        </w:rPr>
+        <w:t xml:space="preserve"> </w:t>
+      </w:r>
+      <w:proofErr w:type="spellStart"/>
+      <w:r>
+        <w:rPr>
+          <w:rFonts w:asciiTheme="majorHAnsi" w:hAnsiTheme="majorHAnsi" w:cstheme="majorHAnsi"/>
+          <w:sz w:val="26"/>
+          <w:szCs w:val="26"/>
+          <w:lang w:val="en-US"/>
+        </w:rPr>
+        <w:t>viên</w:t>
+      </w:r>
+      <w:proofErr w:type="spellEnd"/>
+      <w:r>
+        <w:rPr>
+          <w:rFonts w:asciiTheme="majorHAnsi" w:hAnsiTheme="majorHAnsi" w:cstheme="majorHAnsi"/>
+          <w:sz w:val="26"/>
+          <w:szCs w:val="26"/>
+          <w:lang w:val="en-US"/>
+        </w:rPr>
+        <w:t xml:space="preserve"> </w:t>
+      </w:r>
+      <w:proofErr w:type="spellStart"/>
+      <w:r>
+        <w:rPr>
+          <w:rFonts w:asciiTheme="majorHAnsi" w:hAnsiTheme="majorHAnsi" w:cstheme="majorHAnsi"/>
+          <w:sz w:val="26"/>
+          <w:szCs w:val="26"/>
+          <w:lang w:val="en-US"/>
+        </w:rPr>
+        <w:t>thêm</w:t>
+      </w:r>
+      <w:proofErr w:type="spellEnd"/>
+      <w:r>
+        <w:rPr>
+          <w:rFonts w:asciiTheme="majorHAnsi" w:hAnsiTheme="majorHAnsi" w:cstheme="majorHAnsi"/>
+          <w:sz w:val="26"/>
+          <w:szCs w:val="26"/>
+          <w:lang w:val="en-US"/>
+        </w:rPr>
+        <w:t xml:space="preserve">, </w:t>
+      </w:r>
+      <w:proofErr w:type="spellStart"/>
+      <w:r>
+        <w:rPr>
+          <w:rFonts w:asciiTheme="majorHAnsi" w:hAnsiTheme="majorHAnsi" w:cstheme="majorHAnsi"/>
+          <w:sz w:val="26"/>
+          <w:szCs w:val="26"/>
+          <w:lang w:val="en-US"/>
+        </w:rPr>
+        <w:t>xóa</w:t>
+      </w:r>
+      <w:proofErr w:type="spellEnd"/>
+      <w:r>
+        <w:rPr>
+          <w:rFonts w:asciiTheme="majorHAnsi" w:hAnsiTheme="majorHAnsi" w:cstheme="majorHAnsi"/>
+          <w:sz w:val="26"/>
+          <w:szCs w:val="26"/>
+          <w:lang w:val="en-US"/>
+        </w:rPr>
+        <w:t xml:space="preserve">, </w:t>
+      </w:r>
+      <w:proofErr w:type="spellStart"/>
+      <w:r>
+        <w:rPr>
+          <w:rFonts w:asciiTheme="majorHAnsi" w:hAnsiTheme="majorHAnsi" w:cstheme="majorHAnsi"/>
+          <w:sz w:val="26"/>
+          <w:szCs w:val="26"/>
+          <w:lang w:val="en-US"/>
+        </w:rPr>
+        <w:t>sửa</w:t>
+      </w:r>
+      <w:proofErr w:type="spellEnd"/>
+      <w:r>
+        <w:rPr>
+          <w:rFonts w:asciiTheme="majorHAnsi" w:hAnsiTheme="majorHAnsi" w:cstheme="majorHAnsi"/>
+          <w:sz w:val="26"/>
+          <w:szCs w:val="26"/>
+          <w:lang w:val="en-US"/>
+        </w:rPr>
+        <w:t xml:space="preserve"> album/ </w:t>
       </w:r>
       <w:proofErr w:type="spellStart"/>
       <w:r>
@@ -13223,37 +12808,137 @@
           <w:szCs w:val="26"/>
           <w:lang w:val="en-US"/>
         </w:rPr>
-        <w:t xml:space="preserve"> </w:t>
-      </w:r>
-      <w:proofErr w:type="spellStart"/>
-      <w:r>
-        <w:rPr>
-          <w:rFonts w:asciiTheme="majorHAnsi" w:hAnsiTheme="majorHAnsi" w:cstheme="majorHAnsi"/>
-          <w:sz w:val="26"/>
-          <w:szCs w:val="26"/>
-          <w:lang w:val="en-US"/>
-        </w:rPr>
-        <w:t>yêu</w:t>
-      </w:r>
-      <w:proofErr w:type="spellEnd"/>
-      <w:r>
-        <w:rPr>
-          <w:rFonts w:asciiTheme="majorHAnsi" w:hAnsiTheme="majorHAnsi" w:cstheme="majorHAnsi"/>
-          <w:sz w:val="26"/>
-          <w:szCs w:val="26"/>
-          <w:lang w:val="en-US"/>
-        </w:rPr>
-        <w:t xml:space="preserve"> </w:t>
-      </w:r>
-      <w:proofErr w:type="spellStart"/>
-      <w:r>
-        <w:rPr>
-          <w:rFonts w:asciiTheme="majorHAnsi" w:hAnsiTheme="majorHAnsi" w:cstheme="majorHAnsi"/>
-          <w:sz w:val="26"/>
-          <w:szCs w:val="26"/>
-          <w:lang w:val="en-US"/>
-        </w:rPr>
-        <w:t>thích</w:t>
+        <w:t xml:space="preserve">/ </w:t>
+      </w:r>
+      <w:proofErr w:type="spellStart"/>
+      <w:r>
+        <w:rPr>
+          <w:rFonts w:asciiTheme="majorHAnsi" w:hAnsiTheme="majorHAnsi" w:cstheme="majorHAnsi"/>
+          <w:sz w:val="26"/>
+          <w:szCs w:val="26"/>
+          <w:lang w:val="en-US"/>
+        </w:rPr>
+        <w:t>nghệ</w:t>
+      </w:r>
+      <w:proofErr w:type="spellEnd"/>
+      <w:r>
+        <w:rPr>
+          <w:rFonts w:asciiTheme="majorHAnsi" w:hAnsiTheme="majorHAnsi" w:cstheme="majorHAnsi"/>
+          <w:sz w:val="26"/>
+          <w:szCs w:val="26"/>
+          <w:lang w:val="en-US"/>
+        </w:rPr>
+        <w:t xml:space="preserve"> </w:t>
+      </w:r>
+      <w:proofErr w:type="spellStart"/>
+      <w:r>
+        <w:rPr>
+          <w:rFonts w:asciiTheme="majorHAnsi" w:hAnsiTheme="majorHAnsi" w:cstheme="majorHAnsi"/>
+          <w:sz w:val="26"/>
+          <w:szCs w:val="26"/>
+          <w:lang w:val="en-US"/>
+        </w:rPr>
+        <w:t>sĩ</w:t>
+      </w:r>
+      <w:proofErr w:type="spellEnd"/>
+      <w:r>
+        <w:rPr>
+          <w:rFonts w:asciiTheme="majorHAnsi" w:hAnsiTheme="majorHAnsi" w:cstheme="majorHAnsi"/>
+          <w:sz w:val="26"/>
+          <w:szCs w:val="26"/>
+          <w:lang w:val="en-US"/>
+        </w:rPr>
+        <w:t xml:space="preserve">, </w:t>
+      </w:r>
+      <w:proofErr w:type="spellStart"/>
+      <w:r>
+        <w:rPr>
+          <w:rFonts w:asciiTheme="majorHAnsi" w:hAnsiTheme="majorHAnsi" w:cstheme="majorHAnsi"/>
+          <w:sz w:val="26"/>
+          <w:szCs w:val="26"/>
+          <w:lang w:val="en-US"/>
+        </w:rPr>
+        <w:t>phân</w:t>
+      </w:r>
+      <w:proofErr w:type="spellEnd"/>
+      <w:r>
+        <w:rPr>
+          <w:rFonts w:asciiTheme="majorHAnsi" w:hAnsiTheme="majorHAnsi" w:cstheme="majorHAnsi"/>
+          <w:sz w:val="26"/>
+          <w:szCs w:val="26"/>
+          <w:lang w:val="en-US"/>
+        </w:rPr>
+        <w:t xml:space="preserve"> </w:t>
+      </w:r>
+      <w:proofErr w:type="spellStart"/>
+      <w:r>
+        <w:rPr>
+          <w:rFonts w:asciiTheme="majorHAnsi" w:hAnsiTheme="majorHAnsi" w:cstheme="majorHAnsi"/>
+          <w:sz w:val="26"/>
+          <w:szCs w:val="26"/>
+          <w:lang w:val="en-US"/>
+        </w:rPr>
+        <w:t>quyền</w:t>
+      </w:r>
+      <w:proofErr w:type="spellEnd"/>
+      <w:r>
+        <w:rPr>
+          <w:rFonts w:asciiTheme="majorHAnsi" w:hAnsiTheme="majorHAnsi" w:cstheme="majorHAnsi"/>
+          <w:sz w:val="26"/>
+          <w:szCs w:val="26"/>
+          <w:lang w:val="en-US"/>
+        </w:rPr>
+        <w:t xml:space="preserve"> </w:t>
+      </w:r>
+      <w:proofErr w:type="spellStart"/>
+      <w:r>
+        <w:rPr>
+          <w:rFonts w:asciiTheme="majorHAnsi" w:hAnsiTheme="majorHAnsi" w:cstheme="majorHAnsi"/>
+          <w:sz w:val="26"/>
+          <w:szCs w:val="26"/>
+          <w:lang w:val="en-US"/>
+        </w:rPr>
+        <w:t>cho</w:t>
+      </w:r>
+      <w:proofErr w:type="spellEnd"/>
+      <w:r>
+        <w:rPr>
+          <w:rFonts w:asciiTheme="majorHAnsi" w:hAnsiTheme="majorHAnsi" w:cstheme="majorHAnsi"/>
+          <w:sz w:val="26"/>
+          <w:szCs w:val="26"/>
+          <w:lang w:val="en-US"/>
+        </w:rPr>
+        <w:t xml:space="preserve"> </w:t>
+      </w:r>
+      <w:proofErr w:type="spellStart"/>
+      <w:r>
+        <w:rPr>
+          <w:rFonts w:asciiTheme="majorHAnsi" w:hAnsiTheme="majorHAnsi" w:cstheme="majorHAnsi"/>
+          <w:sz w:val="26"/>
+          <w:szCs w:val="26"/>
+          <w:lang w:val="en-US"/>
+        </w:rPr>
+        <w:t>người</w:t>
+      </w:r>
+      <w:proofErr w:type="spellEnd"/>
+      <w:r>
+        <w:rPr>
+          <w:rFonts w:asciiTheme="majorHAnsi" w:hAnsiTheme="majorHAnsi" w:cstheme="majorHAnsi"/>
+          <w:sz w:val="26"/>
+          <w:szCs w:val="26"/>
+          <w:lang w:val="en-US"/>
+        </w:rPr>
+        <w:t xml:space="preserve"> </w:t>
+      </w:r>
+      <w:proofErr w:type="spellStart"/>
+      <w:r>
+        <w:rPr>
+          <w:rFonts w:asciiTheme="majorHAnsi" w:hAnsiTheme="majorHAnsi" w:cstheme="majorHAnsi"/>
+          <w:sz w:val="26"/>
+          <w:szCs w:val="26"/>
+          <w:lang w:val="en-US"/>
+        </w:rPr>
+        <w:t>dùng</w:t>
       </w:r>
       <w:proofErr w:type="spellEnd"/>
       <w:r>
@@ -13285,47 +12970,8 @@
           <w:szCs w:val="26"/>
           <w:lang w:val="en-US"/>
         </w:rPr>
-        <w:t xml:space="preserve">- </w:t>
-      </w:r>
-      <w:proofErr w:type="spellStart"/>
-      <w:r>
-        <w:rPr>
-          <w:rFonts w:asciiTheme="majorHAnsi" w:hAnsiTheme="majorHAnsi" w:cstheme="majorHAnsi"/>
-          <w:sz w:val="26"/>
-          <w:szCs w:val="26"/>
-          <w:lang w:val="en-US"/>
-        </w:rPr>
-        <w:t>Xây</w:t>
-      </w:r>
-      <w:proofErr w:type="spellEnd"/>
-      <w:r>
-        <w:rPr>
-          <w:rFonts w:asciiTheme="majorHAnsi" w:hAnsiTheme="majorHAnsi" w:cstheme="majorHAnsi"/>
-          <w:sz w:val="26"/>
-          <w:szCs w:val="26"/>
-          <w:lang w:val="en-US"/>
-        </w:rPr>
-        <w:t xml:space="preserve"> </w:t>
-      </w:r>
-      <w:proofErr w:type="spellStart"/>
-      <w:r>
-        <w:rPr>
-          <w:rFonts w:asciiTheme="majorHAnsi" w:hAnsiTheme="majorHAnsi" w:cstheme="majorHAnsi"/>
-          <w:sz w:val="26"/>
-          <w:szCs w:val="26"/>
-          <w:lang w:val="en-US"/>
-        </w:rPr>
-        <w:t>dựng</w:t>
-      </w:r>
-      <w:proofErr w:type="spellEnd"/>
-      <w:r>
-        <w:rPr>
-          <w:rFonts w:asciiTheme="majorHAnsi" w:hAnsiTheme="majorHAnsi" w:cstheme="majorHAnsi"/>
-          <w:sz w:val="26"/>
-          <w:szCs w:val="26"/>
-          <w:lang w:val="en-US"/>
-        </w:rPr>
-        <w:t xml:space="preserve"> Giao </w:t>
+        <w:lastRenderedPageBreak/>
+        <w:t xml:space="preserve">- Giao </w:t>
       </w:r>
       <w:proofErr w:type="spellStart"/>
       <w:r>
@@ -13355,67 +13001,27 @@
           <w:szCs w:val="26"/>
           <w:lang w:val="en-US"/>
         </w:rPr>
-        <w:t>người</w:t>
-      </w:r>
-      <w:proofErr w:type="spellEnd"/>
-      <w:r>
-        <w:rPr>
-          <w:rFonts w:asciiTheme="majorHAnsi" w:hAnsiTheme="majorHAnsi" w:cstheme="majorHAnsi"/>
-          <w:sz w:val="26"/>
-          <w:szCs w:val="26"/>
-          <w:lang w:val="en-US"/>
-        </w:rPr>
-        <w:t xml:space="preserve"> </w:t>
-      </w:r>
-      <w:proofErr w:type="spellStart"/>
-      <w:r>
-        <w:rPr>
-          <w:rFonts w:asciiTheme="majorHAnsi" w:hAnsiTheme="majorHAnsi" w:cstheme="majorHAnsi"/>
-          <w:sz w:val="26"/>
-          <w:szCs w:val="26"/>
-          <w:lang w:val="en-US"/>
-        </w:rPr>
-        <w:t>dùng</w:t>
-      </w:r>
-      <w:proofErr w:type="spellEnd"/>
-      <w:r>
-        <w:rPr>
-          <w:rFonts w:asciiTheme="majorHAnsi" w:hAnsiTheme="majorHAnsi" w:cstheme="majorHAnsi"/>
-          <w:sz w:val="26"/>
-          <w:szCs w:val="26"/>
-          <w:lang w:val="en-US"/>
-        </w:rPr>
-        <w:t xml:space="preserve"> (UI/UX) </w:t>
-      </w:r>
-      <w:proofErr w:type="spellStart"/>
-      <w:r>
-        <w:rPr>
-          <w:rFonts w:asciiTheme="majorHAnsi" w:hAnsiTheme="majorHAnsi" w:cstheme="majorHAnsi"/>
-          <w:sz w:val="26"/>
-          <w:szCs w:val="26"/>
-          <w:lang w:val="en-US"/>
-        </w:rPr>
-        <w:t>trực</w:t>
-      </w:r>
-      <w:proofErr w:type="spellEnd"/>
-      <w:r>
-        <w:rPr>
-          <w:rFonts w:asciiTheme="majorHAnsi" w:hAnsiTheme="majorHAnsi" w:cstheme="majorHAnsi"/>
-          <w:sz w:val="26"/>
-          <w:szCs w:val="26"/>
-          <w:lang w:val="en-US"/>
-        </w:rPr>
-        <w:t xml:space="preserve"> </w:t>
-      </w:r>
-      <w:proofErr w:type="spellStart"/>
-      <w:r>
-        <w:rPr>
-          <w:rFonts w:asciiTheme="majorHAnsi" w:hAnsiTheme="majorHAnsi" w:cstheme="majorHAnsi"/>
-          <w:sz w:val="26"/>
-          <w:szCs w:val="26"/>
-          <w:lang w:val="en-US"/>
-        </w:rPr>
-        <w:t>quan</w:t>
+        <w:t>thân</w:t>
+      </w:r>
+      <w:proofErr w:type="spellEnd"/>
+      <w:r>
+        <w:rPr>
+          <w:rFonts w:asciiTheme="majorHAnsi" w:hAnsiTheme="majorHAnsi" w:cstheme="majorHAnsi"/>
+          <w:sz w:val="26"/>
+          <w:szCs w:val="26"/>
+          <w:lang w:val="en-US"/>
+        </w:rPr>
+        <w:t xml:space="preserve"> </w:t>
+      </w:r>
+      <w:proofErr w:type="spellStart"/>
+      <w:r>
+        <w:rPr>
+          <w:rFonts w:asciiTheme="majorHAnsi" w:hAnsiTheme="majorHAnsi" w:cstheme="majorHAnsi"/>
+          <w:sz w:val="26"/>
+          <w:szCs w:val="26"/>
+          <w:lang w:val="en-US"/>
+        </w:rPr>
+        <w:t>thiện</w:t>
       </w:r>
       <w:proofErr w:type="spellEnd"/>
       <w:r>
@@ -13435,138 +13041,189 @@
           <w:szCs w:val="26"/>
           <w:lang w:val="en-US"/>
         </w:rPr>
-        <w:t>đơn</w:t>
-      </w:r>
-      <w:proofErr w:type="spellEnd"/>
-      <w:r>
-        <w:rPr>
-          <w:rFonts w:asciiTheme="majorHAnsi" w:hAnsiTheme="majorHAnsi" w:cstheme="majorHAnsi"/>
-          <w:sz w:val="26"/>
-          <w:szCs w:val="26"/>
-          <w:lang w:val="en-US"/>
-        </w:rPr>
-        <w:t xml:space="preserve"> </w:t>
-      </w:r>
-      <w:proofErr w:type="spellStart"/>
-      <w:r>
-        <w:rPr>
-          <w:rFonts w:asciiTheme="majorHAnsi" w:hAnsiTheme="majorHAnsi" w:cstheme="majorHAnsi"/>
-          <w:sz w:val="26"/>
-          <w:szCs w:val="26"/>
-          <w:lang w:val="en-US"/>
-        </w:rPr>
-        <w:t>giản</w:t>
-      </w:r>
-      <w:proofErr w:type="spellEnd"/>
-      <w:r>
-        <w:rPr>
-          <w:rFonts w:asciiTheme="majorHAnsi" w:hAnsiTheme="majorHAnsi" w:cstheme="majorHAnsi"/>
-          <w:sz w:val="26"/>
-          <w:szCs w:val="26"/>
-          <w:lang w:val="en-US"/>
-        </w:rPr>
-        <w:t xml:space="preserve">, </w:t>
-      </w:r>
-      <w:proofErr w:type="spellStart"/>
-      <w:r>
-        <w:rPr>
-          <w:rFonts w:asciiTheme="majorHAnsi" w:hAnsiTheme="majorHAnsi" w:cstheme="majorHAnsi"/>
-          <w:sz w:val="26"/>
-          <w:szCs w:val="26"/>
-          <w:lang w:val="en-US"/>
-        </w:rPr>
-        <w:t>hỗ</w:t>
-      </w:r>
-      <w:proofErr w:type="spellEnd"/>
-      <w:r>
-        <w:rPr>
-          <w:rFonts w:asciiTheme="majorHAnsi" w:hAnsiTheme="majorHAnsi" w:cstheme="majorHAnsi"/>
-          <w:sz w:val="26"/>
-          <w:szCs w:val="26"/>
-          <w:lang w:val="en-US"/>
-        </w:rPr>
-        <w:t xml:space="preserve"> </w:t>
-      </w:r>
-      <w:proofErr w:type="spellStart"/>
-      <w:r>
-        <w:rPr>
-          <w:rFonts w:asciiTheme="majorHAnsi" w:hAnsiTheme="majorHAnsi" w:cstheme="majorHAnsi"/>
-          <w:sz w:val="26"/>
-          <w:szCs w:val="26"/>
-          <w:lang w:val="en-US"/>
-        </w:rPr>
-        <w:t>trợ</w:t>
-      </w:r>
-      <w:proofErr w:type="spellEnd"/>
-      <w:r>
-        <w:rPr>
-          <w:rFonts w:asciiTheme="majorHAnsi" w:hAnsiTheme="majorHAnsi" w:cstheme="majorHAnsi"/>
-          <w:sz w:val="26"/>
-          <w:szCs w:val="26"/>
-          <w:lang w:val="en-US"/>
-        </w:rPr>
-        <w:t xml:space="preserve"> </w:t>
-      </w:r>
-      <w:proofErr w:type="spellStart"/>
-      <w:r>
-        <w:rPr>
-          <w:rFonts w:asciiTheme="majorHAnsi" w:hAnsiTheme="majorHAnsi" w:cstheme="majorHAnsi"/>
-          <w:sz w:val="26"/>
-          <w:szCs w:val="26"/>
-          <w:lang w:val="en-US"/>
-        </w:rPr>
-        <w:t>đa</w:t>
-      </w:r>
-      <w:proofErr w:type="spellEnd"/>
-      <w:r>
-        <w:rPr>
-          <w:rFonts w:asciiTheme="majorHAnsi" w:hAnsiTheme="majorHAnsi" w:cstheme="majorHAnsi"/>
-          <w:sz w:val="26"/>
-          <w:szCs w:val="26"/>
-          <w:lang w:val="en-US"/>
-        </w:rPr>
-        <w:t xml:space="preserve"> </w:t>
-      </w:r>
-      <w:proofErr w:type="spellStart"/>
-      <w:r>
-        <w:rPr>
-          <w:rFonts w:asciiTheme="majorHAnsi" w:hAnsiTheme="majorHAnsi" w:cstheme="majorHAnsi"/>
-          <w:sz w:val="26"/>
-          <w:szCs w:val="26"/>
-          <w:lang w:val="en-US"/>
-        </w:rPr>
-        <w:t>thiết</w:t>
-      </w:r>
-      <w:proofErr w:type="spellEnd"/>
-      <w:r>
-        <w:rPr>
-          <w:rFonts w:asciiTheme="majorHAnsi" w:hAnsiTheme="majorHAnsi" w:cstheme="majorHAnsi"/>
-          <w:sz w:val="26"/>
-          <w:szCs w:val="26"/>
-          <w:lang w:val="en-US"/>
-        </w:rPr>
-        <w:t xml:space="preserve"> </w:t>
-      </w:r>
-      <w:proofErr w:type="spellStart"/>
-      <w:r>
-        <w:rPr>
-          <w:rFonts w:asciiTheme="majorHAnsi" w:hAnsiTheme="majorHAnsi" w:cstheme="majorHAnsi"/>
-          <w:sz w:val="26"/>
-          <w:szCs w:val="26"/>
-          <w:lang w:val="en-US"/>
-        </w:rPr>
-        <w:t>bị</w:t>
-      </w:r>
-      <w:proofErr w:type="spellEnd"/>
-      <w:r>
-        <w:rPr>
-          <w:rFonts w:asciiTheme="majorHAnsi" w:hAnsiTheme="majorHAnsi" w:cstheme="majorHAnsi"/>
-          <w:sz w:val="26"/>
-          <w:szCs w:val="26"/>
-          <w:lang w:val="en-US"/>
-        </w:rPr>
-        <w:t xml:space="preserve"> (PC - Tablet - Mobile)</w:t>
-      </w:r>
+        <w:t>hệ</w:t>
+      </w:r>
+      <w:proofErr w:type="spellEnd"/>
+      <w:r>
+        <w:rPr>
+          <w:rFonts w:asciiTheme="majorHAnsi" w:hAnsiTheme="majorHAnsi" w:cstheme="majorHAnsi"/>
+          <w:sz w:val="26"/>
+          <w:szCs w:val="26"/>
+          <w:lang w:val="en-US"/>
+        </w:rPr>
+        <w:t xml:space="preserve"> </w:t>
+      </w:r>
+      <w:proofErr w:type="spellStart"/>
+      <w:r>
+        <w:rPr>
+          <w:rFonts w:asciiTheme="majorHAnsi" w:hAnsiTheme="majorHAnsi" w:cstheme="majorHAnsi"/>
+          <w:sz w:val="26"/>
+          <w:szCs w:val="26"/>
+          <w:lang w:val="en-US"/>
+        </w:rPr>
+        <w:t>thống</w:t>
+      </w:r>
+      <w:proofErr w:type="spellEnd"/>
+      <w:r>
+        <w:rPr>
+          <w:rFonts w:asciiTheme="majorHAnsi" w:hAnsiTheme="majorHAnsi" w:cstheme="majorHAnsi"/>
+          <w:sz w:val="26"/>
+          <w:szCs w:val="26"/>
+          <w:lang w:val="en-US"/>
+        </w:rPr>
+        <w:t xml:space="preserve"> </w:t>
+      </w:r>
+      <w:proofErr w:type="spellStart"/>
+      <w:r>
+        <w:rPr>
+          <w:rFonts w:asciiTheme="majorHAnsi" w:hAnsiTheme="majorHAnsi" w:cstheme="majorHAnsi"/>
+          <w:sz w:val="26"/>
+          <w:szCs w:val="26"/>
+          <w:lang w:val="en-US"/>
+        </w:rPr>
+        <w:t>hoạt</w:t>
+      </w:r>
+      <w:proofErr w:type="spellEnd"/>
+      <w:r>
+        <w:rPr>
+          <w:rFonts w:asciiTheme="majorHAnsi" w:hAnsiTheme="majorHAnsi" w:cstheme="majorHAnsi"/>
+          <w:sz w:val="26"/>
+          <w:szCs w:val="26"/>
+          <w:lang w:val="en-US"/>
+        </w:rPr>
+        <w:t xml:space="preserve"> </w:t>
+      </w:r>
+      <w:proofErr w:type="spellStart"/>
+      <w:r>
+        <w:rPr>
+          <w:rFonts w:asciiTheme="majorHAnsi" w:hAnsiTheme="majorHAnsi" w:cstheme="majorHAnsi"/>
+          <w:sz w:val="26"/>
+          <w:szCs w:val="26"/>
+          <w:lang w:val="en-US"/>
+        </w:rPr>
+        <w:t>động</w:t>
+      </w:r>
+      <w:proofErr w:type="spellEnd"/>
+      <w:r>
+        <w:rPr>
+          <w:rFonts w:asciiTheme="majorHAnsi" w:hAnsiTheme="majorHAnsi" w:cstheme="majorHAnsi"/>
+          <w:sz w:val="26"/>
+          <w:szCs w:val="26"/>
+          <w:lang w:val="en-US"/>
+        </w:rPr>
+        <w:t xml:space="preserve"> </w:t>
+      </w:r>
+      <w:proofErr w:type="spellStart"/>
+      <w:r>
+        <w:rPr>
+          <w:rFonts w:asciiTheme="majorHAnsi" w:hAnsiTheme="majorHAnsi" w:cstheme="majorHAnsi"/>
+          <w:sz w:val="26"/>
+          <w:szCs w:val="26"/>
+          <w:lang w:val="en-US"/>
+        </w:rPr>
+        <w:t>ổn</w:t>
+      </w:r>
+      <w:proofErr w:type="spellEnd"/>
+      <w:r>
+        <w:rPr>
+          <w:rFonts w:asciiTheme="majorHAnsi" w:hAnsiTheme="majorHAnsi" w:cstheme="majorHAnsi"/>
+          <w:sz w:val="26"/>
+          <w:szCs w:val="26"/>
+          <w:lang w:val="en-US"/>
+        </w:rPr>
+        <w:t xml:space="preserve"> </w:t>
+      </w:r>
+      <w:proofErr w:type="spellStart"/>
+      <w:r>
+        <w:rPr>
+          <w:rFonts w:asciiTheme="majorHAnsi" w:hAnsiTheme="majorHAnsi" w:cstheme="majorHAnsi"/>
+          <w:sz w:val="26"/>
+          <w:szCs w:val="26"/>
+          <w:lang w:val="en-US"/>
+        </w:rPr>
+        <w:t>định</w:t>
+      </w:r>
+      <w:proofErr w:type="spellEnd"/>
+      <w:r>
+        <w:rPr>
+          <w:rFonts w:asciiTheme="majorHAnsi" w:hAnsiTheme="majorHAnsi" w:cstheme="majorHAnsi"/>
+          <w:sz w:val="26"/>
+          <w:szCs w:val="26"/>
+          <w:lang w:val="en-US"/>
+        </w:rPr>
+        <w:t xml:space="preserve"> </w:t>
+      </w:r>
+      <w:proofErr w:type="spellStart"/>
+      <w:r>
+        <w:rPr>
+          <w:rFonts w:asciiTheme="majorHAnsi" w:hAnsiTheme="majorHAnsi" w:cstheme="majorHAnsi"/>
+          <w:sz w:val="26"/>
+          <w:szCs w:val="26"/>
+          <w:lang w:val="en-US"/>
+        </w:rPr>
+        <w:t>và</w:t>
+      </w:r>
+      <w:proofErr w:type="spellEnd"/>
+      <w:r>
+        <w:rPr>
+          <w:rFonts w:asciiTheme="majorHAnsi" w:hAnsiTheme="majorHAnsi" w:cstheme="majorHAnsi"/>
+          <w:sz w:val="26"/>
+          <w:szCs w:val="26"/>
+          <w:lang w:val="en-US"/>
+        </w:rPr>
+        <w:t xml:space="preserve"> </w:t>
+      </w:r>
+      <w:proofErr w:type="spellStart"/>
+      <w:r>
+        <w:rPr>
+          <w:rFonts w:asciiTheme="majorHAnsi" w:hAnsiTheme="majorHAnsi" w:cstheme="majorHAnsi"/>
+          <w:sz w:val="26"/>
+          <w:szCs w:val="26"/>
+          <w:lang w:val="en-US"/>
+        </w:rPr>
+        <w:t>dễ</w:t>
+      </w:r>
+      <w:proofErr w:type="spellEnd"/>
+      <w:r>
+        <w:rPr>
+          <w:rFonts w:asciiTheme="majorHAnsi" w:hAnsiTheme="majorHAnsi" w:cstheme="majorHAnsi"/>
+          <w:sz w:val="26"/>
+          <w:szCs w:val="26"/>
+          <w:lang w:val="en-US"/>
+        </w:rPr>
+        <w:t xml:space="preserve"> </w:t>
+      </w:r>
+      <w:proofErr w:type="spellStart"/>
+      <w:r>
+        <w:rPr>
+          <w:rFonts w:asciiTheme="majorHAnsi" w:hAnsiTheme="majorHAnsi" w:cstheme="majorHAnsi"/>
+          <w:sz w:val="26"/>
+          <w:szCs w:val="26"/>
+          <w:lang w:val="en-US"/>
+        </w:rPr>
+        <w:t>sử</w:t>
+      </w:r>
+      <w:proofErr w:type="spellEnd"/>
+      <w:r>
+        <w:rPr>
+          <w:rFonts w:asciiTheme="majorHAnsi" w:hAnsiTheme="majorHAnsi" w:cstheme="majorHAnsi"/>
+          <w:sz w:val="26"/>
+          <w:szCs w:val="26"/>
+          <w:lang w:val="en-US"/>
+        </w:rPr>
+        <w:t xml:space="preserve"> </w:t>
+      </w:r>
+      <w:proofErr w:type="spellStart"/>
+      <w:r>
+        <w:rPr>
+          <w:rFonts w:asciiTheme="majorHAnsi" w:hAnsiTheme="majorHAnsi" w:cstheme="majorHAnsi"/>
+          <w:sz w:val="26"/>
+          <w:szCs w:val="26"/>
+          <w:lang w:val="en-US"/>
+        </w:rPr>
+        <w:t>dụng</w:t>
+      </w:r>
+      <w:proofErr w:type="spellEnd"/>
     </w:p>
     <w:p>
       <w:pPr>
@@ -17838,6 +17495,7 @@
           <w:szCs w:val="48"/>
           <w:lang w:val="en-US"/>
         </w:rPr>
+        <w:lastRenderedPageBreak/>
         <w:tab/>
       </w:r>
       <w:bookmarkStart w:id="10" w:name="_Toc217772264"/>
@@ -18108,7 +17766,7 @@
           <w:noProof/>
         </w:rPr>
         <w:drawing>
-          <wp:inline distT="0" distB="0" distL="0" distR="0" wp14:anchorId="2EF985B3" wp14:editId="143E7EBF">
+          <wp:inline distT="0" distB="0" distL="0" distR="0" wp14:anchorId="2EF985B3" wp14:editId="6F31A43E">
             <wp:extent cx="5731510" cy="2762250"/>
             <wp:effectExtent l="0" t="0" r="2540" b="0"/>
             <wp:docPr id="1880821188" name="Picture 6" descr="A diagram of a circle with text&#10;&#10;AI-generated content may be incorrect."/>
@@ -19583,6 +19241,9 @@
         <w:keepNext/>
       </w:pPr>
       <w:r>
+        <w:rPr>
+          <w:noProof/>
+        </w:rPr>
         <w:drawing>
           <wp:inline distT="0" distB="0" distL="0" distR="0" wp14:anchorId="5C8180A2" wp14:editId="68965D17">
             <wp:extent cx="5731510" cy="2663825"/>
@@ -19762,6 +19423,7 @@
       <w:r>
         <w:rPr>
           <w:rFonts w:asciiTheme="majorHAnsi" w:hAnsiTheme="majorHAnsi" w:cstheme="majorHAnsi"/>
+          <w:noProof/>
           <w:sz w:val="20"/>
           <w:szCs w:val="20"/>
           <w:lang w:val="en-US"/>
@@ -20846,6 +20508,7 @@
       <w:r>
         <w:rPr>
           <w:rFonts w:asciiTheme="majorHAnsi" w:hAnsiTheme="majorHAnsi" w:cstheme="majorHAnsi"/>
+          <w:noProof/>
           <w:sz w:val="26"/>
           <w:szCs w:val="26"/>
           <w:lang w:val="en-US"/>
@@ -21217,16 +20880,7 @@
           <w:szCs w:val="26"/>
           <w:lang w:val="en-US"/>
         </w:rPr>
-        <w:t xml:space="preserve"> </w:t>
-      </w:r>
-      <w:r>
-        <w:rPr>
-          <w:rFonts w:asciiTheme="majorHAnsi" w:hAnsiTheme="majorHAnsi" w:cstheme="majorHAnsi"/>
-          <w:sz w:val="26"/>
-          <w:szCs w:val="26"/>
-          <w:lang w:val="en-US"/>
-        </w:rPr>
-        <w:t>artists</w:t>
+        <w:t xml:space="preserve"> artists</w:t>
       </w:r>
       <w:r>
         <w:rPr>
@@ -22073,6 +21727,7 @@
       <w:r>
         <w:rPr>
           <w:rFonts w:eastAsiaTheme="minorHAnsi" w:cstheme="majorHAnsi"/>
+          <w:noProof/>
           <w:color w:val="auto"/>
           <w:sz w:val="26"/>
           <w:szCs w:val="26"/>
@@ -22279,15 +21934,7 @@
           <w:color w:val="auto"/>
           <w:lang w:val="en-US"/>
         </w:rPr>
-        <w:t xml:space="preserve">Trang </w:t>
-      </w:r>
-      <w:r>
-        <w:rPr>
-          <w:rFonts w:asciiTheme="majorHAnsi" w:hAnsiTheme="majorHAnsi" w:cstheme="majorHAnsi"/>
-          <w:color w:val="auto"/>
-          <w:lang w:val="en-US"/>
-        </w:rPr>
-        <w:t>Songs</w:t>
+        <w:t>Trang Songs</w:t>
       </w:r>
     </w:p>
     <w:p>
@@ -23218,6 +22865,7 @@
       </w:pPr>
       <w:r>
         <w:rPr>
+          <w:noProof/>
           <w:lang w:val="en-US"/>
         </w:rPr>
         <w:drawing>
@@ -23376,9 +23024,11 @@
       <w:r>
         <w:rPr>
           <w:rFonts w:asciiTheme="majorHAnsi" w:hAnsiTheme="majorHAnsi" w:cstheme="majorHAnsi"/>
+          <w:noProof/>
           <w:color w:val="auto"/>
           <w:lang w:val="en-US"/>
         </w:rPr>
+        <w:lastRenderedPageBreak/>
         <w:drawing>
           <wp:inline distT="0" distB="0" distL="0" distR="0" wp14:anchorId="601DAE71" wp14:editId="09071912">
             <wp:extent cx="5731510" cy="2319020"/>
@@ -23581,15 +23231,7 @@
           <w:color w:val="auto"/>
           <w:lang w:val="en-US"/>
         </w:rPr>
-        <w:t xml:space="preserve">Trang </w:t>
-      </w:r>
-      <w:r>
-        <w:rPr>
-          <w:rFonts w:asciiTheme="majorHAnsi" w:hAnsiTheme="majorHAnsi" w:cstheme="majorHAnsi"/>
-          <w:color w:val="auto"/>
-          <w:lang w:val="en-US"/>
-        </w:rPr>
-        <w:t>Users</w:t>
+        <w:t>Trang Users</w:t>
       </w:r>
     </w:p>
     <w:p>
@@ -23657,16 +23299,7 @@
           <w:szCs w:val="26"/>
           <w:lang w:val="en-US"/>
         </w:rPr>
-        <w:t xml:space="preserve"> </w:t>
-      </w:r>
-      <w:r>
-        <w:rPr>
-          <w:rFonts w:asciiTheme="majorHAnsi" w:hAnsiTheme="majorHAnsi" w:cstheme="majorHAnsi"/>
-          <w:sz w:val="26"/>
-          <w:szCs w:val="26"/>
-          <w:lang w:val="en-US"/>
-        </w:rPr>
-        <w:t>Users</w:t>
+        <w:t xml:space="preserve"> Users</w:t>
       </w:r>
       <w:r>
         <w:rPr>
@@ -24372,9 +24005,9 @@
       </w:pPr>
       <w:r>
         <w:rPr>
-          <w:lang w:val="en-US"/>
-        </w:rPr>
-        <w:lastRenderedPageBreak/>
+          <w:noProof/>
+          <w:lang w:val="en-US"/>
+        </w:rPr>
         <w:drawing>
           <wp:inline distT="0" distB="0" distL="0" distR="0" wp14:anchorId="1109AB09" wp14:editId="0C1FE6F2">
             <wp:extent cx="5731510" cy="2319020"/>
@@ -24860,6 +24493,7 @@
           <w:noProof/>
           <w:lang w:val="en-US"/>
         </w:rPr>
+        <w:lastRenderedPageBreak/>
         <w:drawing>
           <wp:inline distT="0" distB="0" distL="0" distR="0" wp14:anchorId="2237A6C2" wp14:editId="00353B0F">
             <wp:extent cx="5731510" cy="2398395"/>
@@ -25128,19 +24762,7 @@
         <w:rPr>
           <w:lang w:val="en-US"/>
         </w:rPr>
-        <w:t xml:space="preserve">Trang </w:t>
-      </w:r>
-      <w:r>
-        <w:rPr>
-          <w:lang w:val="en-US"/>
-        </w:rPr>
-        <w:t>Register</w:t>
-      </w:r>
-      <w:r>
-        <w:rPr>
-          <w:lang w:val="en-US"/>
-        </w:rPr>
-        <w:t xml:space="preserve"> </w:t>
+        <w:t xml:space="preserve">Trang Register </w:t>
       </w:r>
       <w:proofErr w:type="spellStart"/>
       <w:r>
@@ -25328,7 +24950,6 @@
           <w:noProof/>
           <w:lang w:val="en-US"/>
         </w:rPr>
-        <w:lastRenderedPageBreak/>
         <w:drawing>
           <wp:inline distT="0" distB="0" distL="0" distR="0" wp14:anchorId="4E0B6A5C" wp14:editId="7395BFBF">
             <wp:extent cx="5731510" cy="2668270"/>
@@ -25851,8 +25472,10 @@
       </w:pPr>
       <w:r>
         <w:rPr>
-          <w:lang w:val="en-US"/>
-        </w:rPr>
+          <w:noProof/>
+          <w:lang w:val="en-US"/>
+        </w:rPr>
+        <w:lastRenderedPageBreak/>
         <w:drawing>
           <wp:inline distT="0" distB="0" distL="0" distR="0" wp14:anchorId="2B73AE37" wp14:editId="751C961F">
             <wp:extent cx="5731510" cy="2654935"/>
@@ -26004,7 +25627,6 @@
           <w:noProof/>
           <w:lang w:val="en-US"/>
         </w:rPr>
-        <w:lastRenderedPageBreak/>
         <w:drawing>
           <wp:inline distT="0" distB="0" distL="0" distR="0" wp14:anchorId="2155C3E0" wp14:editId="2A417933">
             <wp:extent cx="5731510" cy="5032375"/>
@@ -26058,6 +25680,7 @@
           <w:iCs/>
           <w:lang w:val="en-US"/>
         </w:rPr>
+        <w:lastRenderedPageBreak/>
         <w:t>Hình</w:t>
       </w:r>
       <w:proofErr w:type="spellEnd"/>
@@ -26325,7 +25948,6 @@
           <w:noProof/>
           <w:lang w:val="en-US"/>
         </w:rPr>
-        <w:lastRenderedPageBreak/>
         <w:drawing>
           <wp:inline distT="0" distB="0" distL="0" distR="0" wp14:anchorId="6034C2D9" wp14:editId="5B94665A">
             <wp:extent cx="5731510" cy="2775585"/>
@@ -26524,6 +26146,7 @@
           <w:noProof/>
           <w:lang w:val="en-US"/>
         </w:rPr>
+        <w:lastRenderedPageBreak/>
         <w:drawing>
           <wp:inline distT="0" distB="0" distL="0" distR="0" wp14:anchorId="2FAC014A" wp14:editId="247C9CB4">
             <wp:extent cx="5731510" cy="2442845"/>
@@ -26755,7 +26378,6 @@
           <w:noProof/>
           <w:lang w:val="en-US"/>
         </w:rPr>
-        <w:lastRenderedPageBreak/>
         <w:drawing>
           <wp:inline distT="0" distB="0" distL="0" distR="0" wp14:anchorId="7BE8FE95" wp14:editId="38271385">
             <wp:extent cx="5731510" cy="3009900"/>
@@ -27128,6 +26750,7 @@
           <w:noProof/>
           <w:lang w:val="en-US"/>
         </w:rPr>
+        <w:lastRenderedPageBreak/>
         <w:drawing>
           <wp:inline distT="0" distB="0" distL="0" distR="0" wp14:anchorId="6463AD81" wp14:editId="76710F21">
             <wp:extent cx="5731510" cy="2753360"/>
@@ -27336,7 +26959,6 @@
           <w:noProof/>
           <w:lang w:val="en-US"/>
         </w:rPr>
-        <w:lastRenderedPageBreak/>
         <w:drawing>
           <wp:inline distT="0" distB="0" distL="0" distR="0" wp14:anchorId="5D4C32E7" wp14:editId="3F04F790">
             <wp:extent cx="5731510" cy="2961005"/>
@@ -27532,6 +27154,7 @@
           <w:noProof/>
           <w:lang w:val="en-US"/>
         </w:rPr>
+        <w:lastRenderedPageBreak/>
         <w:drawing>
           <wp:inline distT="0" distB="0" distL="0" distR="0" wp14:anchorId="1A7D9067" wp14:editId="1FD2FE6E">
             <wp:extent cx="5731510" cy="4269740"/>
@@ -27707,7 +27330,6 @@
           <w:noProof/>
           <w:lang w:val="en-US"/>
         </w:rPr>
-        <w:lastRenderedPageBreak/>
         <w:drawing>
           <wp:inline distT="0" distB="0" distL="0" distR="0" wp14:anchorId="7D3964FC" wp14:editId="407605BE">
             <wp:extent cx="5731510" cy="3115945"/>
@@ -27895,6 +27517,7 @@
           <w:noProof/>
           <w:lang w:val="en-US"/>
         </w:rPr>
+        <w:lastRenderedPageBreak/>
         <w:drawing>
           <wp:inline distT="0" distB="0" distL="0" distR="0" wp14:anchorId="68B68D32" wp14:editId="7D299CEC">
             <wp:extent cx="5731510" cy="2559050"/>
@@ -28070,7 +27693,6 @@
           <w:szCs w:val="26"/>
           <w:lang w:val="en-US"/>
         </w:rPr>
-        <w:lastRenderedPageBreak/>
         <w:drawing>
           <wp:inline distT="0" distB="0" distL="0" distR="0" wp14:anchorId="7C0810C2" wp14:editId="0160F166">
             <wp:extent cx="5731510" cy="3016250"/>
@@ -35377,17 +34999,17 @@
           <w:szCs w:val="26"/>
           <w:lang w:val="en-US"/>
         </w:rPr>
-        <w:t xml:space="preserve"> n</w:t>
-      </w:r>
-      <w:proofErr w:type="spellStart"/>
-      <w:r>
-        <w:rPr>
-          <w:rFonts w:asciiTheme="majorHAnsi" w:hAnsiTheme="majorHAnsi" w:cstheme="majorHAnsi"/>
-          <w:sz w:val="26"/>
-          <w:szCs w:val="26"/>
-          <w:lang w:val="en-US"/>
-        </w:rPr>
-        <w:t>ăng</w:t>
+        <w:t xml:space="preserve"> </w:t>
+      </w:r>
+      <w:proofErr w:type="spellStart"/>
+      <w:r>
+        <w:rPr>
+          <w:rFonts w:asciiTheme="majorHAnsi" w:hAnsiTheme="majorHAnsi" w:cstheme="majorHAnsi"/>
+          <w:sz w:val="26"/>
+          <w:szCs w:val="26"/>
+          <w:lang w:val="en-US"/>
+        </w:rPr>
+        <w:t>năng</w:t>
       </w:r>
       <w:proofErr w:type="spellEnd"/>
       <w:r>
@@ -43389,6 +43011,10 @@
 </file>
 
 <file path=customXml/item1.xml><?xml version="1.0" encoding="utf-8"?>
+<b:Sources xmlns:b="http://schemas.openxmlformats.org/officeDocument/2006/bibliography" xmlns="http://schemas.openxmlformats.org/officeDocument/2006/bibliography" SelectedStyle="\APASixthEditionOfficeOnline.xsl" StyleName="APA" Version="6"/>
+</file>
+
+<file path=customXml/item2.xml><?xml version="1.0" encoding="utf-8"?>
 <s:customData xmlns="http://www.wps.cn/officeDocument/2013/wpsCustomData" xmlns:s="http://www.wps.cn/officeDocument/2013/wpsCustomData">
   <customSectProps>
     <customSectPr/>
@@ -43400,22 +43026,18 @@
 </s:customData>
 </file>
 
-<file path=customXml/item2.xml><?xml version="1.0" encoding="utf-8"?>
-<b:Sources xmlns:b="http://schemas.openxmlformats.org/officeDocument/2006/bibliography" xmlns="http://schemas.openxmlformats.org/officeDocument/2006/bibliography" SelectedStyle="\APASixthEditionOfficeOnline.xsl" StyleName="APA" Version="6"/>
+<file path=customXml/itemProps1.xml><?xml version="1.0" encoding="utf-8"?>
+<ds:datastoreItem xmlns:ds="http://schemas.openxmlformats.org/officeDocument/2006/customXml" ds:itemID="{92D4163A-9B09-475B-BA30-C21FF843B9AC}">
+  <ds:schemaRefs>
+    <ds:schemaRef ds:uri="http://schemas.openxmlformats.org/officeDocument/2006/bibliography"/>
+  </ds:schemaRefs>
+</ds:datastoreItem>
 </file>
 
-<file path=customXml/itemProps1.xml><?xml version="1.0" encoding="utf-8"?>
+<file path=customXml/itemProps2.xml><?xml version="1.0" encoding="utf-8"?>
 <ds:datastoreItem xmlns:ds="http://schemas.openxmlformats.org/officeDocument/2006/customXml" ds:itemID="{B1977F7D-205B-4081-913C-38D41E755F92}">
   <ds:schemaRefs>
     <ds:schemaRef ds:uri="http://www.wps.cn/officeDocument/2013/wpsCustomData"/>
   </ds:schemaRefs>
 </ds:datastoreItem>
-</file>
-
-<file path=customXml/itemProps2.xml><?xml version="1.0" encoding="utf-8"?>
-<ds:datastoreItem xmlns:ds="http://schemas.openxmlformats.org/officeDocument/2006/customXml" ds:itemID="{92D4163A-9B09-475B-BA30-C21FF843B9AC}">
-  <ds:schemaRefs>
-    <ds:schemaRef ds:uri="http://schemas.openxmlformats.org/officeDocument/2006/bibliography"/>
-  </ds:schemaRefs>
-</ds:datastoreItem>
 </file>
</xml_diff>